<commit_message>
Rewrite three supervisor drafts on xNPV 0 with the writing skill
The Game Value, pricing and draft-pick documents in 40_DOCS/Supervisor_Drafts
are rewritten story-first: each step says why it exists, what it does, what
was tested, and what to take away. Every mechanism was re-read from xNPV 0's
code at 7f91f0e. Corrections from the code: signed extensions count, the exit
hazard uses pre-valuation windows, and the draft document gains D29-D31.
Adds 40_DOCS/Glossary.md, the session log, and the state-file entries.
No code changed.

Co-Authored-By: Claude Opus 5.5 <noreply@anthropic.com>
Claude-Session: https://claude.ai/code/session_012AEtdKJ5ckd75t3aofGMyr
</commit_message>
<xml_diff>
--- a/40_DOCS/Supervisor_Drafts/Circularity and Game Value.docx
+++ b/40_DOCS/Supervisor_Drafts/Circularity and Game Value.docx
@@ -5,580 +5,665 @@
     <w:p>
       <w:pPr>
         <w:pStyle w:val="Title"/>
+      </w:pPr>
+      <w:r>
+        <w:t>Circularity and Game Value</w:t>
+      </w:r>
+    </w:p>
+    <w:p>
+      <w:pPr/>
+      <w:r>
+        <w:t>This document covers the first version of the player model (xNPV 0). It explains Game Value, a measure of on-ice performance built from the NHL's own game records. It then explains the check that uses Game Value to test the model's estimate of a skater's production.</w:t>
+      </w:r>
+    </w:p>
+    <w:p>
+      <w:pPr>
+        <w:pStyle w:val="Heading1"/>
+      </w:pPr>
+      <w:r>
+        <w:t>1. The Problem: A Check That Is Not Circular</w:t>
+      </w:r>
+    </w:p>
+    <w:p>
+      <w:pPr/>
+      <w:r>
+        <w:t>The player model measures skater production with Bacon WAR, a vendor's estimate of each skater's wins above replacement. It then prices a win from what clubs pay. It fits salaries against players' Bacon WAR and reads off the price of one win, as the pricing document explains. Each dollar value in the model, therefore, rests on Bacon WAR.</w:t>
+      </w:r>
+    </w:p>
+    <w:p>
+      <w:pPr/>
+      <w:r>
+        <w:t>That leaves a question the model cannot answer alone: does its production estimate measure real performance? A check against another Bacon-based number cannot answer it. Both sides would share the same inputs and the same errors, so they could agree because of what they share. This is the circularity problem. A useful check needs a yardstick built with no Bacon input.</w:t>
+      </w:r>
+    </w:p>
+    <w:p>
+      <w:pPr/>
+      <w:r>
+        <w:t>The production estimate under test is trailing production, which is a weighted average of a skater's Bacon WAR from the two seasons before the valuation season. It puts 60% on the more recent season and 40% on the one before. The Data, Production, and Aging document explains how it is built and projected forward. The check in Section 6 asks whether trailing production predicts how a player goes on to perform when performance is measured independently.</w:t>
+      </w:r>
+    </w:p>
+    <w:p>
+      <w:pPr>
+        <w:pStyle w:val="Heading1"/>
+      </w:pPr>
+      <w:r>
+        <w:t>2. The Idea: An Independent Measure from the NHL's Records</w:t>
+      </w:r>
+    </w:p>
+    <w:p>
+      <w:pPr/>
+      <w:r>
+        <w:t>Game Value is that independent yardstick. It is built from the NHL's public shot, penalty, and shift records for 11,870 games from 2017-18 through 2025-26. Nothing in it comes from Bacon. For each game, it credits a skater with the scoring chances his team created while he was on the ice and charges him with the chances his team allowed. It then adds the value of the penalties he drew and took. Its unit is goals.</w:t>
+      </w:r>
+    </w:p>
+    <w:p>
+      <w:pPr/>
+      <w:r>
+        <w:t>Game Value is stored game by game, while Bacon WAR is published only as season totals. That difference gives Game Value a second job, dividing a traded player's season between his two clubs (Section 8).</w:t>
+      </w:r>
+    </w:p>
+    <w:p>
+      <w:pPr>
+        <w:pStyle w:val="Heading1"/>
+      </w:pPr>
+      <w:r>
+        <w:t>3. How Game Value Is Built</w:t>
+      </w:r>
+    </w:p>
+    <w:p>
+      <w:pPr>
+        <w:pStyle w:val="Heading2"/>
+      </w:pPr>
+      <w:r>
+        <w:t>Step 1: Value each shot by its chance of scoring</w:t>
+      </w:r>
+    </w:p>
+    <w:p>
+      <w:pPr/>
+      <w:r>
+        <w:t>Goals are rare, and whether a given shot goes in is largely luck. A chance from the slot that the goaltender saves still says something about the play that created it. So Game Value counts chances, not goals. Each shot receives an expected-goals value, or xG, which is its estimated probability of becoming a goal. A shot from a bad angle far from the net might carry 0.03, a 3% chance of scoring. A chance from the slot might carry 0.25.</w:t>
+      </w:r>
+    </w:p>
+    <w:p>
+      <w:pPr/>
+      <w:r>
+        <w:t>A logistic regression, a standard model that turns a set of inputs into a probability between 0 and 1, sets these values. It uses five inputs: distance to the net, angle to the net, shot type, the manpower situation, and whether the shot is a rebound. A rebound is a shot within three seconds of a saved shot, with no faceoff in between. The model covers unblocked attempts with a goaltender in net. It leaves out blocked shots, because the NHL records a blocked shot at the blocker's position rather than the shooter's. It also leaves out empty-net attempts and shootouts. The shooter's identity is excluded by design, so the value prices the chance rather than the player who took it.</w:t>
+      </w:r>
+    </w:p>
+    <w:p>
+      <w:pPr/>
+      <w:r>
+        <w:t>The shot model was fitted on the regular seasons up to 2023-24 and tested on 2024-25 and 2025-26, which it had not seen. On those held-out seasons, the most dangerous tenth of shots was predicted to score 21.9% of the time and scored 17.0% of the time. Part of that gap is a lower conversion rate on high-danger chances in recent seasons, and part comes from the model's straight-line treatment of distance. The final model is refitted on all regular seasons together, and its expected goals sum to actual goals at a ratio of about 1.000 across the full sample. The take-away is that each chance is valued in goals, and the values add up to the goals scored.</w:t>
+      </w:r>
+    </w:p>
+    <w:p>
+      <w:pPr>
+        <w:pStyle w:val="Heading2"/>
+      </w:pPr>
+      <w:r>
+        <w:t>Step 2: Adjust for the score</w:t>
+      </w:r>
+    </w:p>
+    <w:p>
+      <w:pPr/>
+      <w:r>
+        <w:t>A team that is behind presses for goals and outshoots its opponent, and a team that is ahead sits back. A player on a team that often trails would collect chances because of the scoreboard rather than his own play. To remove that effect, the model reweights each even-strength chance by the score when it was created. The weights come from the league's own data, so that neither leading nor trailing gives free credit. For example, suppose trailing teams created 54% of even-strength expected goals while one team led. A chance created while trailing would then count 0.5 ÷ 0.54 ≈ 0.93 of a chance, and one created while leading would count 0.5 ÷ 0.46 ≈ 1.09. Tied play counts at 1.0.</w:t>
+      </w:r>
+    </w:p>
+    <w:p>
+      <w:pPr/>
+      <w:r>
+        <w:t>Power-play and shorthanded chances receive no score adjustment. On special teams the manpower edge, not the scoreboard, drives how many shots a team takes, and the shot model already prices the manpower situation.</w:t>
+      </w:r>
+    </w:p>
+    <w:p>
+      <w:pPr>
+        <w:pStyle w:val="Heading2"/>
+      </w:pPr>
+      <w:r>
+        <w:t>Step 3: Split each chance among the skaters on the ice</w:t>
+      </w:r>
+    </w:p>
+    <w:p>
+      <w:pPr/>
+      <w:r>
+        <w:t>Each adjusted chance is credited equally to the attacking skaters on the ice and charged equally to the defending skaters. On a five-on-four chance, each of the five attackers receives one-fifth of the credit, and each of the four penalty killers receives one-quarter of the charge. Each chance enters once as a credit and once as an equal charge. Across the league, on-ice credits and charges sum to exactly zero, and a team's players sum to the team's adjusted chance differential. The code checks both on each run.</w:t>
+      </w:r>
+    </w:p>
+    <w:p>
+      <w:pPr/>
+      <w:r>
+        <w:t>The equal split has a known cost. It cannot tell the player who drove a shift from a linemate who contributed little. For that reason raw Game Value is used to divide seasons and as a cross-check, never as a standalone measure of a player's value.</w:t>
+      </w:r>
+    </w:p>
+    <w:p>
+      <w:pPr>
+        <w:pStyle w:val="Heading2"/>
+      </w:pPr>
+      <w:r>
+        <w:t>Step 4: Add penalties</w:t>
+      </w:r>
+    </w:p>
+    <w:p>
+      <w:pPr/>
+      <w:r>
+        <w:t>A drawn penalty gives the team a power play, and a power play is worth goals. The model values one drawn penalty at the league's power-play goals minus shorthanded goals, divided by the number of penalties that create a power play. The result is 0.2097 goals. Coincidental penalties and misconducts are left out because they create no power play. Majors are priced the same as minors, a simplification that is recorded in the code. The player who draws a penalty gains 0.2097 goals, and the player who takes it loses the same amount.</w:t>
+      </w:r>
+    </w:p>
+    <w:p>
+      <w:pPr/>
+      <w:r>
+        <w:t>A player's Game Value for a game is his on-ice total plus his penalty total, in goals.</w:t>
+      </w:r>
+    </w:p>
+    <w:p>
+      <w:pPr>
+        <w:pStyle w:val="Heading1"/>
+      </w:pPr>
+      <w:r>
+        <w:t>4. Does Game Value Track Results?</w:t>
+      </w:r>
+    </w:p>
+    <w:p>
+      <w:pPr/>
+      <w:r>
+        <w:t>Comparing Game Value with the scoreboard is a real test, because the allocation does not guarantee agreement. Game Value credits expected goals, so a good chance counts even when the shot misses or is saved. A team can win the chance battle and still lose the game.</w:t>
+      </w:r>
+    </w:p>
+    <w:p>
+      <w:pPr/>
+      <w:r>
+        <w:t>For single games, team Game Value explains 3.4% of the variation in goal differential. That figure is low, and it is expected to be: one game of hockey is mostly luck. As a reference point, a development check on MoneyPuck's 2023-24 shot files found that team-game expected goals explained about 7% of the variation in single-game goals. The outcome and the sample differ from Game Value's, so this shows only that a low single-game figure is normal. Over full seasons, team Game Value explains 58.3% of the variation in goal differential. Each goal of Game Value goes with 1.085 goals of actual differential. Nothing was fitted to produce either figure.</w:t>
+      </w:r>
+    </w:p>
+    <w:p>
+      <w:pPr/>
+      <w:r>
+        <w:t>The take-away is that over a season, Game Value tracks what happens on the scoreboard.</w:t>
+      </w:r>
+    </w:p>
+    <w:p>
+      <w:pPr>
+        <w:pStyle w:val="Heading1"/>
+      </w:pPr>
+      <w:r>
+        <w:t>5. An Adjusted Version, and Why the Model Keeps Bacon WAR</w:t>
+      </w:r>
+    </w:p>
+    <w:p>
+      <w:pPr/>
+      <w:r>
+        <w:t>Because the equal split cannot separate linemates, the project built an adjusted version, GV-adj, to test whether Game Value could replace Bacon WAR. At five-on-five it uses a ridge regression on shifts. Lineups change many times in a season, and those changes let the regression separate a player's effect from the effects of his teammates and opponents. It also controls for home ice, score, and the zone where each shift started. This method follows the adjusted plus-minus literature in hockey (Macdonald 2012; Gramacy, Jensen, and Taddy 2013; Thomas et al. 2013). Other manpower situations keep the equal split. GV-adj also adds penalties and each shooter's goals above expected, shrunk toward zero when the shooter has taken few shots.</w:t>
+      </w:r>
+    </w:p>
+    <w:p>
+      <w:pPr/>
+      <w:r>
+        <w:t>The settings in GV-adj come from the game data alone. The strength of the ridge penalty is chosen by cross-validation on held-out games, and the shrinkage of finishing comes from a variance decomposition. No setting was tuned on contracts or on agreement with Bacon. Otherwise GV-adj could not serve as an independent check.</w:t>
+      </w:r>
+    </w:p>
+    <w:p>
+      <w:pPr/>
+      <w:r>
+        <w:t>A pre-registered set of four tests asked whether GV-adj could stand in for Bacon WAR. GV-adj came close to Bacon's results for forwards and stayed almost flat for defencemen. Much of a defenceman's value lies in chances that never develop, and shot and shift records cannot see them. The tests cannot say which measure values defence more accurately. The model, therefore, keeps Bacon WAR for skater value and gives Game Value two scoped jobs: the circularity check and the division of traded players' seasons.</w:t>
+      </w:r>
+    </w:p>
+    <w:p>
+      <w:pPr>
+        <w:pStyle w:val="Heading1"/>
+      </w:pPr>
+      <w:r>
+        <w:t>6. The Circularity Check</w:t>
+      </w:r>
+    </w:p>
+    <w:p>
+      <w:pPr/>
+      <w:r>
+        <w:t>The check compares each skater's trailing production before season t with his GV-adj in season t. Trailing production uses only seasons a club could see before season t began, so nothing from season t reaches it. Both sides are measured in wins. Bacon WAR is already in wins, and GV-adj is converted from goals at 5.903 goals per win, a rate estimated from the league's own team records. No dollars enter the outcome side, so the Bacon-based price of a win stays out of the benchmark.</w:t>
+      </w:r>
+    </w:p>
+    <w:p>
+      <w:pPr/>
+      <w:r>
+        <w:t>Two further versions replace GV-adj with raw Game Value, on the same players and seasons. One measures performance above a replacement-level baseline, the reference point Bacon WAR uses. The other keeps the zero-sum split. Both are built from the same games as GV-adj. They show whether the result depends on the GV-adj adjustments, and they are not independent evidence.</w:t>
+      </w:r>
+    </w:p>
+    <w:p>
+      <w:pPr/>
+      <w:r>
+        <w:t>The sample is 6,027 player-seasons over the nine seasons from 2017-18 through 2025-26, which is 88% of the skater-seasons the model priced. Most players appear in several seasons, so the number of independent players behind the figures is smaller than the row count. No interval that resamples players was computed.</w:t>
+      </w:r>
+    </w:p>
+    <w:p>
+      <w:pPr>
+        <w:keepNext/>
+      </w:pPr>
+      <w:r>
         <w:rPr>
-          <w:rFonts w:asciiTheme="minorHAnsi" w:hAnsiTheme="minorHAnsi" w:cstheme="minorHAnsi"/>
+          <w:b/>
         </w:rPr>
-      </w:pPr>
-      <w:r>
-        <w:rPr>
-          <w:rFonts w:asciiTheme="minorHAnsi" w:hAnsiTheme="minorHAnsi" w:cstheme="minorHAnsi"/>
-        </w:rPr>
-        <w:t>Circularity and Game Value</w:t>
-      </w:r>
-    </w:p>
-    <w:p>
-      <w:pPr>
-        <w:rPr>
-          <w:rFonts w:asciiTheme="minorHAnsi" w:hAnsiTheme="minorHAnsi" w:cstheme="minorHAnsi"/>
-        </w:rPr>
-      </w:pPr>
-      <w:r>
-        <w:rPr>
-          <w:rFonts w:asciiTheme="minorHAnsi" w:hAnsiTheme="minorHAnsi" w:cstheme="minorHAnsi"/>
-        </w:rPr>
-        <w:t xml:space="preserve">Game Value provides an independent check on the model’s production estimates. It measures on-ice performance using NHL play-by-play and shift data, with no Bacon WAR inputs. The two measures agree more closely for forwards than for defencemen. </w:t>
+        <w:t>Table 1.</w:t>
+      </w:r>
+      <w:r>
+        <w:t xml:space="preserve"> Trailing production against performance in the same season (6,027 player-seasons)</w:t>
+      </w:r>
+    </w:p>
+    <w:tbl>
+      <w:tblPr>
+        <w:tblW w:type="auto" w:w="0"/>
+        <w:jc w:val="center"/>
+        <w:tblBorders>
+          <w:top w:val="single" w:sz="4" w:space="0" w:color="808080"/>
+          <w:left w:val="single" w:sz="4" w:space="0" w:color="808080"/>
+          <w:bottom w:val="single" w:sz="4" w:space="0" w:color="808080"/>
+          <w:right w:val="single" w:sz="4" w:space="0" w:color="808080"/>
+          <w:insideH w:val="single" w:sz="4" w:space="0" w:color="808080"/>
+          <w:insideV w:val="single" w:sz="4" w:space="0" w:color="808080"/>
+        </w:tblBorders>
+        <w:tblLayout w:type="fixed"/>
+        <w:tblLook w:firstColumn="1" w:firstRow="1" w:lastColumn="0" w:lastRow="0" w:noHBand="0" w:noVBand="1" w:val="04A0"/>
+      </w:tblPr>
+      <w:tblGrid>
+        <w:gridCol w:w="2340"/>
+        <w:gridCol w:w="2340"/>
+        <w:gridCol w:w="2340"/>
+        <w:gridCol w:w="2340"/>
+      </w:tblGrid>
+      <w:tr>
+        <w:trPr>
+          <w:tblHeader w:val="true"/>
+        </w:trPr>
+        <w:tc>
+          <w:tcPr>
+            <w:tcW w:type="dxa" w:w="3443"/>
+            <w:shd w:val="clear" w:color="auto" w:fill="D9E2F3"/>
+          </w:tcPr>
+          <w:p>
+            <w:pPr>
+              <w:spacing w:after="0" w:before="0"/>
+            </w:pPr>
+            <w:r>
+              <w:rPr>
+                <w:b/>
+                <w:sz w:val="19"/>
+              </w:rPr>
+              <w:t>Outcome measure</w:t>
+            </w:r>
+          </w:p>
+        </w:tc>
+        <w:tc>
+          <w:tcPr>
+            <w:tcW w:type="dxa" w:w="1183"/>
+            <w:shd w:val="clear" w:color="auto" w:fill="D9E2F3"/>
+          </w:tcPr>
+          <w:p>
+            <w:pPr>
+              <w:spacing w:after="0" w:before="0"/>
+              <w:jc w:val="center"/>
+            </w:pPr>
+            <w:r>
+              <w:rPr>
+                <w:b/>
+                <w:sz w:val="19"/>
+              </w:rPr>
+              <w:t>Correlation</w:t>
+            </w:r>
+          </w:p>
+        </w:tc>
+        <w:tc>
+          <w:tcPr>
+            <w:tcW w:type="dxa" w:w="1721"/>
+            <w:shd w:val="clear" w:color="auto" w:fill="D9E2F3"/>
+          </w:tcPr>
+          <w:p>
+            <w:pPr>
+              <w:spacing w:after="0" w:before="0"/>
+              <w:jc w:val="center"/>
+            </w:pPr>
+            <w:r>
+              <w:rPr>
+                <w:b/>
+                <w:sz w:val="19"/>
+              </w:rPr>
+              <w:t>Rank correlation</w:t>
+            </w:r>
+          </w:p>
+        </w:tc>
+        <w:tc>
+          <w:tcPr>
+            <w:tcW w:type="dxa" w:w="3012"/>
+            <w:shd w:val="clear" w:color="auto" w:fill="D9E2F3"/>
+          </w:tcPr>
+          <w:p>
+            <w:pPr>
+              <w:spacing w:after="0" w:before="0"/>
+              <w:jc w:val="center"/>
+            </w:pPr>
+            <w:r>
+              <w:rPr>
+                <w:b/>
+                <w:sz w:val="19"/>
+              </w:rPr>
+              <w:t>Share of variation explained</w:t>
+            </w:r>
+          </w:p>
+        </w:tc>
+      </w:tr>
+      <w:tr>
+        <w:tc>
+          <w:tcPr>
+            <w:tcW w:type="dxa" w:w="3443"/>
+          </w:tcPr>
+          <w:p>
+            <w:pPr>
+              <w:spacing w:after="0" w:before="0"/>
+            </w:pPr>
+            <w:r>
+              <w:rPr>
+                <w:sz w:val="19"/>
+              </w:rPr>
+              <w:t>GV-adj (primary)</w:t>
+            </w:r>
+          </w:p>
+        </w:tc>
+        <w:tc>
+          <w:tcPr>
+            <w:tcW w:type="dxa" w:w="1183"/>
+          </w:tcPr>
+          <w:p>
+            <w:pPr>
+              <w:spacing w:after="0" w:before="0"/>
+              <w:jc w:val="center"/>
+            </w:pPr>
+            <w:r>
+              <w:rPr>
+                <w:sz w:val="19"/>
+              </w:rPr>
+              <w:t>0.576</w:t>
+            </w:r>
+          </w:p>
+        </w:tc>
+        <w:tc>
+          <w:tcPr>
+            <w:tcW w:type="dxa" w:w="1721"/>
+          </w:tcPr>
+          <w:p>
+            <w:pPr>
+              <w:spacing w:after="0" w:before="0"/>
+              <w:jc w:val="center"/>
+            </w:pPr>
+            <w:r>
+              <w:rPr>
+                <w:sz w:val="19"/>
+              </w:rPr>
+              <w:t>0.460</w:t>
+            </w:r>
+          </w:p>
+        </w:tc>
+        <w:tc>
+          <w:tcPr>
+            <w:tcW w:type="dxa" w:w="3012"/>
+          </w:tcPr>
+          <w:p>
+            <w:pPr>
+              <w:spacing w:after="0" w:before="0"/>
+              <w:jc w:val="center"/>
+            </w:pPr>
+            <w:r>
+              <w:rPr>
+                <w:sz w:val="19"/>
+              </w:rPr>
+              <w:t>33.1%</w:t>
+            </w:r>
+          </w:p>
+        </w:tc>
+      </w:tr>
+      <w:tr>
+        <w:tc>
+          <w:tcPr>
+            <w:tcW w:type="dxa" w:w="3443"/>
+          </w:tcPr>
+          <w:p>
+            <w:pPr>
+              <w:spacing w:after="0" w:before="0"/>
+            </w:pPr>
+            <w:r>
+              <w:rPr>
+                <w:sz w:val="19"/>
+              </w:rPr>
+              <w:t>Raw Game Value above replacement</w:t>
+            </w:r>
+          </w:p>
+        </w:tc>
+        <w:tc>
+          <w:tcPr>
+            <w:tcW w:type="dxa" w:w="1183"/>
+          </w:tcPr>
+          <w:p>
+            <w:pPr>
+              <w:spacing w:after="0" w:before="0"/>
+              <w:jc w:val="center"/>
+            </w:pPr>
+            <w:r>
+              <w:rPr>
+                <w:sz w:val="19"/>
+              </w:rPr>
+              <w:t>0.609</w:t>
+            </w:r>
+          </w:p>
+        </w:tc>
+        <w:tc>
+          <w:tcPr>
+            <w:tcW w:type="dxa" w:w="1721"/>
+          </w:tcPr>
+          <w:p>
+            <w:pPr>
+              <w:spacing w:after="0" w:before="0"/>
+              <w:jc w:val="center"/>
+            </w:pPr>
+            <w:r>
+              <w:rPr>
+                <w:sz w:val="19"/>
+              </w:rPr>
+              <w:t>0.523</w:t>
+            </w:r>
+          </w:p>
+        </w:tc>
+        <w:tc>
+          <w:tcPr>
+            <w:tcW w:type="dxa" w:w="3012"/>
+          </w:tcPr>
+          <w:p>
+            <w:pPr>
+              <w:spacing w:after="0" w:before="0"/>
+              <w:jc w:val="center"/>
+            </w:pPr>
+            <w:r>
+              <w:rPr>
+                <w:sz w:val="19"/>
+              </w:rPr>
+              <w:t>37.1%</w:t>
+            </w:r>
+          </w:p>
+        </w:tc>
+      </w:tr>
+      <w:tr>
+        <w:tc>
+          <w:tcPr>
+            <w:tcW w:type="dxa" w:w="3443"/>
+          </w:tcPr>
+          <w:p>
+            <w:pPr>
+              <w:spacing w:after="0" w:before="0"/>
+            </w:pPr>
+            <w:r>
+              <w:rPr>
+                <w:sz w:val="19"/>
+              </w:rPr>
+              <w:t>Raw Game Value, zero-sum</w:t>
+            </w:r>
+          </w:p>
+        </w:tc>
+        <w:tc>
+          <w:tcPr>
+            <w:tcW w:type="dxa" w:w="1183"/>
+          </w:tcPr>
+          <w:p>
+            <w:pPr>
+              <w:spacing w:after="0" w:before="0"/>
+              <w:jc w:val="center"/>
+            </w:pPr>
+            <w:r>
+              <w:rPr>
+                <w:sz w:val="19"/>
+              </w:rPr>
+              <w:t>0.564</w:t>
+            </w:r>
+          </w:p>
+        </w:tc>
+        <w:tc>
+          <w:tcPr>
+            <w:tcW w:type="dxa" w:w="1721"/>
+          </w:tcPr>
+          <w:p>
+            <w:pPr>
+              <w:spacing w:after="0" w:before="0"/>
+              <w:jc w:val="center"/>
+            </w:pPr>
+            <w:r>
+              <w:rPr>
+                <w:sz w:val="19"/>
+              </w:rPr>
+              <w:t>0.461</w:t>
+            </w:r>
+          </w:p>
+        </w:tc>
+        <w:tc>
+          <w:tcPr>
+            <w:tcW w:type="dxa" w:w="3012"/>
+          </w:tcPr>
+          <w:p>
+            <w:pPr>
+              <w:spacing w:after="0" w:before="0"/>
+              <w:jc w:val="center"/>
+            </w:pPr>
+            <w:r>
+              <w:rPr>
+                <w:sz w:val="19"/>
+              </w:rPr>
+              <w:t>31.8%</w:t>
+            </w:r>
+          </w:p>
+        </w:tc>
+      </w:tr>
+    </w:tbl>
+    <w:p>
+      <w:pPr/>
+    </w:p>
+    <w:p>
+      <w:pPr/>
+      <w:r>
+        <w:t>The primary correlation of 0.576 ranged from 0.55 to 0.61 across the nine seasons, so no single season drives it. Against GV-adj one season further ahead, the correlation was 0.538. The two raw versions give 0.609 and 0.564, and each weakens slightly one season further ahead. The result does not depend on the GV-adj adjustments.</w:t>
+      </w:r>
+    </w:p>
+    <w:p>
+      <w:pPr/>
+      <w:r>
+        <w:t>The check is much stronger for forwards than for defencemen. The primary correlation is 0.648 for forwards and 0.302 for defencemen. The above-replacement raw version gives defencemen 0.442, but the replacement baseline is known to favour offensive defencemen, so that figure overstates the agreement. The other two versions put defencemen at 0.28 to 0.30. This is the same weakness on defence that Section 5 found, seen from the outcome side.</w:t>
       </w:r>
     </w:p>
     <w:p>
       <w:pPr>
         <w:pStyle w:val="Heading1"/>
-        <w:rPr>
-          <w:rFonts w:asciiTheme="minorHAnsi" w:hAnsiTheme="minorHAnsi" w:cstheme="minorHAnsi"/>
-        </w:rPr>
-      </w:pPr>
-      <w:r>
-        <w:rPr>
-          <w:rFonts w:asciiTheme="minorHAnsi" w:hAnsiTheme="minorHAnsi" w:cstheme="minorHAnsi"/>
-        </w:rPr>
-        <w:t>The circularity problem</w:t>
-      </w:r>
-    </w:p>
-    <w:p>
-      <w:pPr>
-        <w:rPr>
-          <w:rFonts w:asciiTheme="minorHAnsi" w:hAnsiTheme="minorHAnsi" w:cstheme="minorHAnsi"/>
-        </w:rPr>
-      </w:pPr>
-      <w:r>
-        <w:rPr>
-          <w:rFonts w:asciiTheme="minorHAnsi" w:hAnsiTheme="minorHAnsi" w:cstheme="minorHAnsi"/>
-        </w:rPr>
-        <w:t>The model estimates the price of a win from actual contract prices and players’ Bacon WAR. It then uses that rate to put a dollar value on production. Checking those valuations against another Bacon-based measure would leave both sides dependent on the same measure of performance. They could agree partly because they share assumptions or errors. Game Value provides a separate check on the production estimate.</w:t>
-      </w:r>
-    </w:p>
-    <w:p>
-      <w:pPr>
-        <w:rPr>
-          <w:rFonts w:asciiTheme="minorHAnsi" w:hAnsiTheme="minorHAnsi" w:cstheme="minorHAnsi"/>
-        </w:rPr>
-      </w:pPr>
-      <w:r>
-        <w:rPr>
-          <w:rFonts w:asciiTheme="minorHAnsi" w:hAnsiTheme="minorHAnsi" w:cstheme="minorHAnsi"/>
-        </w:rPr>
-        <w:t>Trailing production is a weighted blend of a player’s Bacon WAR from seasons before the valuation date, as explained in the</w:t>
-      </w:r>
-      <w:r>
-        <w:rPr>
-          <w:rFonts w:asciiTheme="minorHAnsi" w:hAnsiTheme="minorHAnsi" w:cstheme="minorHAnsi"/>
-        </w:rPr>
-        <w:t xml:space="preserve"> Data, Production, and Aging</w:t>
-      </w:r>
-      <w:r>
-        <w:rPr>
-          <w:rFonts w:asciiTheme="minorHAnsi" w:hAnsiTheme="minorHAnsi" w:cstheme="minorHAnsi"/>
-        </w:rPr>
-        <w:t xml:space="preserve"> document</w:t>
-      </w:r>
-      <w:r>
-        <w:rPr>
-          <w:rFonts w:asciiTheme="minorHAnsi" w:hAnsiTheme="minorHAnsi" w:cstheme="minorHAnsi"/>
-        </w:rPr>
-        <w:t xml:space="preserve">, which is then projected </w:t>
-      </w:r>
-      <w:r>
-        <w:rPr>
-          <w:rFonts w:asciiTheme="minorHAnsi" w:hAnsiTheme="minorHAnsi" w:cstheme="minorHAnsi"/>
-        </w:rPr>
-        <w:t>forward through an aging curve. The pricing document covers the market regression that converts production into dollars. The check here compares trailing production with subsequent performance.</w:t>
+      </w:pPr>
+      <w:r>
+        <w:t>7. What the Check Shows, and What It Does Not</w:t>
+      </w:r>
+    </w:p>
+    <w:p>
+      <w:pPr/>
+      <w:r>
+        <w:t>Players with higher trailing production went on to produce more Game Value, clearly for forwards and partly for defencemen. An independent measure moves with the model's production estimate. This is convergent validity, and it supports the starting point of each valuation.</w:t>
+      </w:r>
+    </w:p>
+    <w:p>
+      <w:pPr/>
+      <w:r>
+        <w:t>The check has four limits.</w:t>
+      </w:r>
+    </w:p>
+    <w:p>
+      <w:pPr>
+        <w:pStyle w:val="ListParagraph"/>
+        <w:numPr>
+          <w:ilvl w:val="0"/>
+          <w:numId w:val="1"/>
+        </w:numPr>
+      </w:pPr>
+      <w:r>
+        <w:t>It runs in wins. It tests the production estimate, not whether the dollar price of a win is right.</w:t>
+      </w:r>
+    </w:p>
+    <w:p>
+      <w:pPr>
+        <w:pStyle w:val="ListParagraph"/>
+        <w:numPr>
+          <w:ilvl w:val="0"/>
+          <w:numId w:val="1"/>
+        </w:numPr>
+      </w:pPr>
+      <w:r>
+        <w:t>It tests the starting estimate, not the aging projection built on it or the contract values that follow.</w:t>
+      </w:r>
+    </w:p>
+    <w:p>
+      <w:pPr>
+        <w:pStyle w:val="ListParagraph"/>
+        <w:numPr>
+          <w:ilvl w:val="0"/>
+          <w:numId w:val="1"/>
+        </w:numPr>
+      </w:pPr>
+      <w:r>
+        <w:t>Game Value shares no inputs or model with Bacon WAR, but both describe the same games. Some agreement is expected because they measure the same players' performances.</w:t>
+      </w:r>
+    </w:p>
+    <w:p>
+      <w:pPr>
+        <w:pStyle w:val="ListParagraph"/>
+        <w:numPr>
+          <w:ilvl w:val="0"/>
+          <w:numId w:val="1"/>
+        </w:numPr>
+      </w:pPr>
+      <w:r>
+        <w:t>The shot model's final fit includes the seasons it scores, so the outcome side has seen its own season's shots. This touches only the outcome measure, not trailing production.</w:t>
+      </w:r>
+    </w:p>
+    <w:p>
+      <w:pPr/>
+      <w:r>
+        <w:t>No pass mark was set before the check, and none was added afterward. The result is descriptive.</w:t>
       </w:r>
     </w:p>
     <w:p>
       <w:pPr>
         <w:pStyle w:val="Heading1"/>
-        <w:rPr>
-          <w:rFonts w:asciiTheme="minorHAnsi" w:hAnsiTheme="minorHAnsi" w:cstheme="minorHAnsi"/>
-        </w:rPr>
-      </w:pPr>
-      <w:r>
-        <w:rPr>
-          <w:rFonts w:asciiTheme="minorHAnsi" w:hAnsiTheme="minorHAnsi" w:cstheme="minorHAnsi"/>
-        </w:rPr>
-        <w:t>How Game Value is calculated</w:t>
-      </w:r>
-    </w:p>
-    <w:p>
-      <w:pPr>
-        <w:rPr>
-          <w:rFonts w:asciiTheme="minorHAnsi" w:hAnsiTheme="minorHAnsi" w:cstheme="minorHAnsi"/>
-        </w:rPr>
-      </w:pPr>
-      <w:r>
-        <w:rPr>
-          <w:rFonts w:asciiTheme="minorHAnsi" w:hAnsiTheme="minorHAnsi" w:cstheme="minorHAnsi"/>
-        </w:rPr>
-        <w:t>Game Value uses the NHL’s shot, penalty, and shift records. Shots are described by their location, type, and manpower situation. Shift records identify which skaters were on the ice when each event occurred. The shot model includes unblocked attempts with a goaltender in net; blocked shots, empty-net attempts, and shootouts are excluded.</w:t>
-      </w:r>
-      <w:r>
-        <w:rPr>
-          <w:rFonts w:asciiTheme="minorHAnsi" w:hAnsiTheme="minorHAnsi" w:cstheme="minorHAnsi"/>
-        </w:rPr>
-        <w:t xml:space="preserve"> Importantly, Game Value is calculated and stored on a </w:t>
-      </w:r>
-      <w:r>
-        <w:rPr>
-          <w:rFonts w:asciiTheme="minorHAnsi" w:hAnsiTheme="minorHAnsi" w:cstheme="minorHAnsi"/>
-        </w:rPr>
-        <w:t>game-by-game</w:t>
-      </w:r>
-      <w:r>
-        <w:rPr>
-          <w:rFonts w:asciiTheme="minorHAnsi" w:hAnsiTheme="minorHAnsi" w:cstheme="minorHAnsi"/>
-        </w:rPr>
-        <w:t xml:space="preserve"> basis. </w:t>
-      </w:r>
-      <w:r>
-        <w:rPr>
-          <w:rFonts w:asciiTheme="minorHAnsi" w:hAnsiTheme="minorHAnsi" w:cstheme="minorHAnsi"/>
-        </w:rPr>
-        <w:t xml:space="preserve">Bacon WAR </w:t>
-      </w:r>
-      <w:r>
-        <w:rPr>
-          <w:rFonts w:asciiTheme="minorHAnsi" w:hAnsiTheme="minorHAnsi" w:cstheme="minorHAnsi"/>
-        </w:rPr>
-        <w:t xml:space="preserve">is not made available </w:t>
-      </w:r>
-      <w:r>
-        <w:rPr>
-          <w:rFonts w:asciiTheme="minorHAnsi" w:hAnsiTheme="minorHAnsi" w:cstheme="minorHAnsi"/>
-        </w:rPr>
-        <w:t xml:space="preserve">for individual games </w:t>
-      </w:r>
-      <w:r>
-        <w:rPr>
-          <w:rFonts w:asciiTheme="minorHAnsi" w:hAnsiTheme="minorHAnsi" w:cstheme="minorHAnsi"/>
-        </w:rPr>
-        <w:t xml:space="preserve">and only aggregate season-level </w:t>
-      </w:r>
-      <w:r>
-        <w:rPr>
-          <w:rFonts w:asciiTheme="minorHAnsi" w:hAnsiTheme="minorHAnsi" w:cstheme="minorHAnsi"/>
-        </w:rPr>
-        <w:t xml:space="preserve">WAR </w:t>
-      </w:r>
-      <w:r>
-        <w:rPr>
-          <w:rFonts w:asciiTheme="minorHAnsi" w:hAnsiTheme="minorHAnsi" w:cstheme="minorHAnsi"/>
-        </w:rPr>
-        <w:t>is.</w:t>
-      </w:r>
-    </w:p>
-    <w:p>
-      <w:pPr>
-        <w:rPr>
-          <w:rFonts w:asciiTheme="minorHAnsi" w:hAnsiTheme="minorHAnsi" w:cstheme="minorHAnsi"/>
-        </w:rPr>
-      </w:pPr>
-      <w:r>
-        <w:rPr>
-          <w:rFonts w:asciiTheme="minorHAnsi" w:hAnsiTheme="minorHAnsi" w:cstheme="minorHAnsi"/>
-        </w:rPr>
-        <w:t xml:space="preserve">Each included shot receives an expected-goals value, or </w:t>
-      </w:r>
-      <w:proofErr w:type="spellStart"/>
-      <w:r>
-        <w:rPr>
-          <w:rFonts w:asciiTheme="minorHAnsi" w:hAnsiTheme="minorHAnsi" w:cstheme="minorHAnsi"/>
-        </w:rPr>
-        <w:t>xG</w:t>
-      </w:r>
-      <w:proofErr w:type="spellEnd"/>
-      <w:r>
-        <w:rPr>
-          <w:rFonts w:asciiTheme="minorHAnsi" w:hAnsiTheme="minorHAnsi" w:cstheme="minorHAnsi"/>
-        </w:rPr>
-        <w:t xml:space="preserve">, which is its estimated probability of becoming a goal. A distant shot from a bad angle might have an </w:t>
-      </w:r>
-      <w:proofErr w:type="spellStart"/>
-      <w:r>
-        <w:rPr>
-          <w:rFonts w:asciiTheme="minorHAnsi" w:hAnsiTheme="minorHAnsi" w:cstheme="minorHAnsi"/>
-        </w:rPr>
-        <w:t>xG</w:t>
-      </w:r>
-      <w:proofErr w:type="spellEnd"/>
-      <w:r>
-        <w:rPr>
-          <w:rFonts w:asciiTheme="minorHAnsi" w:hAnsiTheme="minorHAnsi" w:cstheme="minorHAnsi"/>
-        </w:rPr>
-        <w:t xml:space="preserve"> of 0.03, meaning a 3% chance of scoring; a chance from the slot might have an </w:t>
-      </w:r>
-      <w:proofErr w:type="spellStart"/>
-      <w:r>
-        <w:rPr>
-          <w:rFonts w:asciiTheme="minorHAnsi" w:hAnsiTheme="minorHAnsi" w:cstheme="minorHAnsi"/>
-        </w:rPr>
-        <w:t>xG</w:t>
-      </w:r>
-      <w:proofErr w:type="spellEnd"/>
-      <w:r>
-        <w:rPr>
-          <w:rFonts w:asciiTheme="minorHAnsi" w:hAnsiTheme="minorHAnsi" w:cstheme="minorHAnsi"/>
-        </w:rPr>
-        <w:t xml:space="preserve"> of 0.25. A logistic regression estimates these probabilities from distance, angle, shot type, manpower situation, and whether the shot was a rebound.</w:t>
-      </w:r>
-    </w:p>
-    <w:p>
-      <w:pPr>
-        <w:rPr>
-          <w:rFonts w:asciiTheme="minorHAnsi" w:hAnsiTheme="minorHAnsi" w:cstheme="minorHAnsi"/>
-        </w:rPr>
-      </w:pPr>
-      <w:r>
-        <w:rPr>
-          <w:rFonts w:asciiTheme="minorHAnsi" w:hAnsiTheme="minorHAnsi" w:cstheme="minorHAnsi"/>
-        </w:rPr>
-        <w:t>Strength state distinguishes even strength, power plays, and shorthanded play, and is already included in the shot model. Score state distinguishes teams that are leading, trailing, or tied. Trailing teams tend to press for goals and generate more shots, while leading teams tend to defend and generate fewer. At even strength, the score adjustment reduces the weight of chances created while trailing and increases it while leading. Power-play and shorthanded chances receive no score adjustment.</w:t>
-      </w:r>
-    </w:p>
-    <w:p>
-      <w:pPr>
-        <w:rPr>
-          <w:rFonts w:asciiTheme="minorHAnsi" w:hAnsiTheme="minorHAnsi" w:cstheme="minorHAnsi"/>
-        </w:rPr>
-      </w:pPr>
-      <w:r>
-        <w:rPr>
-          <w:rFonts w:asciiTheme="minorHAnsi" w:hAnsiTheme="minorHAnsi" w:cstheme="minorHAnsi"/>
-        </w:rPr>
-        <w:t>Each adjusted chance is divided equally among the attacking skaters on the ice and charged equally to the defending skaters. The total credit and debit are equal, although the share per player differs when the teams have different numbers of skaters. For example, on a five-on-four chance, each attacker receives one-fifth of the credit and each penalty killer receives one-quarter of the debit.</w:t>
-      </w:r>
-      <w:r>
-        <w:rPr>
-          <w:rFonts w:asciiTheme="minorHAnsi" w:hAnsiTheme="minorHAnsi" w:cstheme="minorHAnsi"/>
-        </w:rPr>
-        <w:t xml:space="preserve"> </w:t>
-      </w:r>
-      <w:r>
-        <w:rPr>
-          <w:rFonts w:asciiTheme="minorHAnsi" w:hAnsiTheme="minorHAnsi" w:cstheme="minorHAnsi"/>
-        </w:rPr>
-        <w:t>The metric covers 11,870 games from 2017-18 through 2025-26. Across the league, the on-ice credits and debits sum to zero.</w:t>
-      </w:r>
-    </w:p>
-    <w:p>
-      <w:pPr>
-        <w:rPr>
-          <w:rFonts w:asciiTheme="minorHAnsi" w:hAnsiTheme="minorHAnsi" w:cstheme="minorHAnsi"/>
-        </w:rPr>
-      </w:pPr>
-      <w:r>
-        <w:rPr>
-          <w:rFonts w:asciiTheme="minorHAnsi" w:hAnsiTheme="minorHAnsi" w:cstheme="minorHAnsi"/>
-        </w:rPr>
-        <w:t xml:space="preserve">Penalties are valued separately. Drawing an eligible penalty earns the estimated net goal value of a power play; taking one incurs the same debit. That value is estimated from regular-season power-play goals minus shorthanded goals, divided by eligible penalties. Coincidental penalties and misconducts are </w:t>
-      </w:r>
-      <w:r>
-        <w:rPr>
-          <w:rFonts w:asciiTheme="minorHAnsi" w:hAnsiTheme="minorHAnsi" w:cstheme="minorHAnsi"/>
-        </w:rPr>
-        <w:lastRenderedPageBreak/>
-        <w:t>excluded. A player’s on-ice and penalty totals are added for each game. The result is Game Value, measured in goals.</w:t>
-      </w:r>
-      <w:r>
-        <w:rPr>
-          <w:rFonts w:asciiTheme="minorHAnsi" w:hAnsiTheme="minorHAnsi" w:cstheme="minorHAnsi"/>
-        </w:rPr>
-        <w:t xml:space="preserve"> </w:t>
-      </w:r>
-    </w:p>
-    <w:p>
-      <w:pPr>
-        <w:rPr>
-          <w:rFonts w:asciiTheme="minorHAnsi" w:hAnsiTheme="minorHAnsi" w:cstheme="minorHAnsi"/>
-        </w:rPr>
-      </w:pPr>
-      <w:r>
-        <w:rPr>
-          <w:rFonts w:asciiTheme="minorHAnsi" w:hAnsiTheme="minorHAnsi" w:cstheme="minorHAnsi"/>
-        </w:rPr>
-        <w:t>The second check compares team Game Value with actual goal differential. Game Value assigns credit for expected goals, so a good chance contributes value even when the shot misses or is saved. The scoreboard records only goals that went in. A team can therefore generate more Game Value and still lose, and agreement between the two is not guaranteed by the allocation formula.</w:t>
-      </w:r>
-    </w:p>
-    <w:p>
-      <w:pPr>
-        <w:rPr>
-          <w:rFonts w:asciiTheme="minorHAnsi" w:hAnsiTheme="minorHAnsi" w:cstheme="minorHAnsi"/>
-        </w:rPr>
-      </w:pPr>
-      <w:r>
-        <w:rPr>
-          <w:rFonts w:asciiTheme="minorHAnsi" w:hAnsiTheme="minorHAnsi" w:cstheme="minorHAnsi"/>
-        </w:rPr>
-        <w:t xml:space="preserve">Game Value explains 3.4% of the variation in goal differential between individual games. For context, a development check using </w:t>
-      </w:r>
-      <w:proofErr w:type="spellStart"/>
-      <w:r>
-        <w:rPr>
-          <w:rFonts w:asciiTheme="minorHAnsi" w:hAnsiTheme="minorHAnsi" w:cstheme="minorHAnsi"/>
-        </w:rPr>
-        <w:t>MoneyPuck’s</w:t>
-      </w:r>
-      <w:proofErr w:type="spellEnd"/>
-      <w:r>
-        <w:rPr>
-          <w:rFonts w:asciiTheme="minorHAnsi" w:hAnsiTheme="minorHAnsi" w:cstheme="minorHAnsi"/>
-        </w:rPr>
-        <w:t xml:space="preserve"> 2023-24 shot files found that team-game expected goals explained about 7% of the variation in goals scored. The outcome and sample differ from Game Value, so this is a reference point rather than a direct comparison. It also shows that a low single-game figure is not unique to this model. Across full seasons, Game Value explains 58.3% of the variation in team goal differential.</w:t>
-      </w:r>
-    </w:p>
-    <w:p>
-      <w:pPr>
-        <w:rPr>
-          <w:rFonts w:asciiTheme="minorHAnsi" w:hAnsiTheme="minorHAnsi" w:cstheme="minorHAnsi"/>
-        </w:rPr>
-      </w:pPr>
-      <w:r>
-        <w:rPr>
-          <w:rFonts w:asciiTheme="minorHAnsi" w:hAnsiTheme="minorHAnsi" w:cstheme="minorHAnsi"/>
-        </w:rPr>
-        <w:t>An equal split cannot distinguish a player who drove a shift from a linemate who contributed little. Raw Game Value is therefore used for allocation and validation rather than as a standalone estimate of individual player value.</w:t>
-      </w:r>
-    </w:p>
-    <w:p>
-      <w:pPr>
-        <w:pStyle w:val="Heading1"/>
-        <w:rPr>
-          <w:rFonts w:asciiTheme="minorHAnsi" w:hAnsiTheme="minorHAnsi" w:cstheme="minorHAnsi"/>
-        </w:rPr>
-      </w:pPr>
-      <w:r>
-        <w:rPr>
-          <w:rFonts w:asciiTheme="minorHAnsi" w:hAnsiTheme="minorHAnsi" w:cstheme="minorHAnsi"/>
-        </w:rPr>
-        <w:t>Why the model retains Bacon WAR</w:t>
-      </w:r>
-    </w:p>
-    <w:p>
-      <w:pPr>
-        <w:rPr>
-          <w:rFonts w:asciiTheme="minorHAnsi" w:hAnsiTheme="minorHAnsi" w:cstheme="minorHAnsi"/>
-        </w:rPr>
-      </w:pPr>
-      <w:r>
-        <w:rPr>
-          <w:rFonts w:asciiTheme="minorHAnsi" w:hAnsiTheme="minorHAnsi" w:cstheme="minorHAnsi"/>
-        </w:rPr>
-        <w:t>An adjusted version, GV-adj, was tested as a possible replacement for Bacon WAR. At five-on-five, it uses lineup changes to separate a player’s contribution from the effects of teammates and opponents, while accounting for deployment. Other strength situations retain the equal split. GV-adj also includes penalties and goals scored above expected, with finishing estimates pulled toward zero when the evidence is weak.</w:t>
-      </w:r>
-    </w:p>
-    <w:p>
-      <w:pPr>
-        <w:rPr>
-          <w:rFonts w:asciiTheme="minorHAnsi" w:hAnsiTheme="minorHAnsi" w:cstheme="minorHAnsi"/>
-        </w:rPr>
-      </w:pPr>
-      <w:r>
-        <w:rPr>
-          <w:rFonts w:asciiTheme="minorHAnsi" w:hAnsiTheme="minorHAnsi" w:cstheme="minorHAnsi"/>
-        </w:rPr>
-        <w:t>GV-adj came closer to Bacon’s results for forwards than for defencemen. Play-by-play data offer limited information about defensive contributions that prevent chances from developing, which may explain part of the gap. The comparison cannot tell us which metric measures defensive value more accurately. The model retains Bacon WAR for skater valuation.</w:t>
-      </w:r>
-    </w:p>
-    <w:p>
-      <w:pPr>
-        <w:pStyle w:val="Heading1"/>
-        <w:rPr>
-          <w:rFonts w:asciiTheme="minorHAnsi" w:hAnsiTheme="minorHAnsi" w:cstheme="minorHAnsi"/>
-        </w:rPr>
-      </w:pPr>
-      <w:r>
-        <w:rPr>
-          <w:rFonts w:asciiTheme="minorHAnsi" w:hAnsiTheme="minorHAnsi" w:cstheme="minorHAnsi"/>
-        </w:rPr>
-        <w:t>Allocating value after a midseason trade</w:t>
-      </w:r>
-    </w:p>
-    <w:p>
-      <w:pPr>
-        <w:rPr>
-          <w:rFonts w:asciiTheme="minorHAnsi" w:hAnsiTheme="minorHAnsi" w:cstheme="minorHAnsi"/>
-        </w:rPr>
-      </w:pPr>
-      <w:r>
-        <w:rPr>
-          <w:rFonts w:asciiTheme="minorHAnsi" w:hAnsiTheme="minorHAnsi" w:cstheme="minorHAnsi"/>
-        </w:rPr>
-        <w:t>For a player traded during the season, the model must divide his full-season Bacon WAR between teams. A split based on games played assumes he contributed equally in every game, even if his performance changed after the trade.</w:t>
-      </w:r>
-    </w:p>
-    <w:p>
-      <w:pPr>
-        <w:rPr>
-          <w:rFonts w:asciiTheme="minorHAnsi" w:hAnsiTheme="minorHAnsi" w:cstheme="minorHAnsi"/>
-        </w:rPr>
-      </w:pPr>
-      <w:r>
-        <w:rPr>
-          <w:rFonts w:asciiTheme="minorHAnsi" w:hAnsiTheme="minorHAnsi" w:cstheme="minorHAnsi"/>
-        </w:rPr>
-        <w:t>Points offer more detail, but capture only part of what WAR measures. Defensive play and on-ice contributions can produce value without a point for the player. Dividing WAR by points would assign too much weight to games in which he scored and too little to contributions outside the scoresheet. Game Value uses shot quality and penalties to capture a broader share of that performance.</w:t>
-      </w:r>
-    </w:p>
-    <w:p>
-      <w:pPr>
-        <w:rPr>
-          <w:rFonts w:asciiTheme="minorHAnsi" w:hAnsiTheme="minorHAnsi" w:cstheme="minorHAnsi"/>
-        </w:rPr>
-      </w:pPr>
-      <w:r>
-        <w:rPr>
-          <w:rFonts w:asciiTheme="minorHAnsi" w:hAnsiTheme="minorHAnsi" w:cstheme="minorHAnsi"/>
-        </w:rPr>
-        <w:t>To allocate value for players traded mid-season,</w:t>
-      </w:r>
-      <w:r>
-        <w:rPr>
-          <w:rFonts w:asciiTheme="minorHAnsi" w:hAnsiTheme="minorHAnsi" w:cstheme="minorHAnsi"/>
-        </w:rPr>
-        <w:t xml:space="preserve"> we find the Game Value total for a given player for each team he played for during that season and allocate Bacon WAR according to those proportions.</w:t>
-      </w:r>
-      <w:r>
-        <w:rPr>
-          <w:rFonts w:asciiTheme="minorHAnsi" w:hAnsiTheme="minorHAnsi" w:cstheme="minorHAnsi"/>
-        </w:rPr>
-        <w:t xml:space="preserve"> </w:t>
-      </w:r>
-      <w:r>
-        <w:rPr>
-          <w:rFonts w:asciiTheme="minorHAnsi" w:hAnsiTheme="minorHAnsi" w:cstheme="minorHAnsi"/>
-        </w:rPr>
-        <w:t xml:space="preserve">Needed still </w:t>
-      </w:r>
-      <w:r>
-        <w:rPr>
-          <w:rFonts w:asciiTheme="minorHAnsi" w:hAnsiTheme="minorHAnsi" w:cstheme="minorHAnsi"/>
-        </w:rPr>
-        <w:t>a</w:t>
-      </w:r>
-      <w:r>
-        <w:rPr>
-          <w:rFonts w:asciiTheme="minorHAnsi" w:hAnsiTheme="minorHAnsi" w:cstheme="minorHAnsi"/>
-        </w:rPr>
-        <w:t>re</w:t>
-      </w:r>
-      <w:r>
-        <w:rPr>
-          <w:rFonts w:asciiTheme="minorHAnsi" w:hAnsiTheme="minorHAnsi" w:cstheme="minorHAnsi"/>
-        </w:rPr>
-        <w:t xml:space="preserve"> rule</w:t>
-      </w:r>
-      <w:r>
-        <w:rPr>
-          <w:rFonts w:asciiTheme="minorHAnsi" w:hAnsiTheme="minorHAnsi" w:cstheme="minorHAnsi"/>
-        </w:rPr>
-        <w:t>s</w:t>
-      </w:r>
-      <w:r>
-        <w:rPr>
-          <w:rFonts w:asciiTheme="minorHAnsi" w:hAnsiTheme="minorHAnsi" w:cstheme="minorHAnsi"/>
-        </w:rPr>
-        <w:t xml:space="preserve"> for seasons with near-zero Game Value or team stints with opposite signs.</w:t>
-      </w:r>
-    </w:p>
-    <w:p>
-      <w:pPr>
-        <w:pStyle w:val="Heading1"/>
-        <w:rPr>
-          <w:rFonts w:asciiTheme="minorHAnsi" w:hAnsiTheme="minorHAnsi" w:cstheme="minorHAnsi"/>
-        </w:rPr>
-      </w:pPr>
-      <w:r>
-        <w:rPr>
-          <w:rFonts w:asciiTheme="minorHAnsi" w:hAnsiTheme="minorHAnsi" w:cstheme="minorHAnsi"/>
-        </w:rPr>
-        <w:lastRenderedPageBreak/>
-        <w:t>Results of the circularity check</w:t>
-      </w:r>
-    </w:p>
-    <w:p>
-      <w:pPr>
-        <w:rPr>
-          <w:rFonts w:asciiTheme="minorHAnsi" w:hAnsiTheme="minorHAnsi" w:cstheme="minorHAnsi"/>
-        </w:rPr>
-      </w:pPr>
-      <w:r>
-        <w:rPr>
-          <w:rFonts w:asciiTheme="minorHAnsi" w:hAnsiTheme="minorHAnsi" w:cstheme="minorHAnsi"/>
-        </w:rPr>
-        <w:t>The main check compares each player’s trailing WAR, calculated before the season, with his performance that season according to GV-adj. Both sides are measured in wins: Bacon WAR is already in win units, and GV-adj is converted from goals to wins. Across 6,027 player-seasons, the correlation was 0.576. It ranged from 0.55 to 0.61 in each of the nine seasons, suggesting that no single season drove the result. Comparing the same trailing estimate with performance one season further ahead gave a correlation of 0.538.</w:t>
-      </w:r>
-    </w:p>
-    <w:p>
-      <w:pPr>
-        <w:rPr>
-          <w:rFonts w:asciiTheme="minorHAnsi" w:hAnsiTheme="minorHAnsi" w:cstheme="minorHAnsi"/>
-        </w:rPr>
-      </w:pPr>
-      <w:r>
-        <w:rPr>
-          <w:rFonts w:asciiTheme="minorHAnsi" w:hAnsiTheme="minorHAnsi" w:cstheme="minorHAnsi"/>
-        </w:rPr>
-        <w:t>Two checks used raw Game Value. One measured performance above a replacement-level baseline, the reference point used by Bacon WAR. The other retained the zero-sum allocation, in which player contributions sum to the team’s total. Their correlations with trailing WAR were 0.609 and 0.564, respectively. Both were stable across seasons and weakened slightly at the later horizon. These are variants built from the same games, so their agreement shows that the result does not depend entirely on the GV-adj adjustments.</w:t>
-      </w:r>
-    </w:p>
-    <w:p>
-      <w:pPr>
-        <w:rPr>
-          <w:rFonts w:asciiTheme="minorHAnsi" w:hAnsiTheme="minorHAnsi" w:cstheme="minorHAnsi"/>
-        </w:rPr>
-      </w:pPr>
-      <w:r>
-        <w:rPr>
-          <w:rFonts w:asciiTheme="minorHAnsi" w:hAnsiTheme="minorHAnsi" w:cstheme="minorHAnsi"/>
-        </w:rPr>
-        <w:t>The main correlation was 0.648 for forwards and 0.302 for defencemen. The replacement-based raw variant gave a higher defensive correlation of 0.442, but the rebase can inflate that figure. The other two versions put the defensive correlation closer to 0.28-0.30.</w:t>
-      </w:r>
-    </w:p>
-    <w:p>
-      <w:pPr>
-        <w:pStyle w:val="Heading1"/>
-        <w:rPr>
-          <w:rFonts w:asciiTheme="minorHAnsi" w:hAnsiTheme="minorHAnsi" w:cstheme="minorHAnsi"/>
-        </w:rPr>
-      </w:pPr>
-      <w:r>
-        <w:rPr>
-          <w:rFonts w:asciiTheme="minorHAnsi" w:hAnsiTheme="minorHAnsi" w:cstheme="minorHAnsi"/>
-        </w:rPr>
-        <w:t>What the results establish</w:t>
-      </w:r>
-    </w:p>
-    <w:p>
-      <w:pPr>
-        <w:rPr>
-          <w:rFonts w:asciiTheme="minorHAnsi" w:hAnsiTheme="minorHAnsi" w:cstheme="minorHAnsi"/>
-        </w:rPr>
-      </w:pPr>
-      <w:r>
-        <w:rPr>
-          <w:rFonts w:asciiTheme="minorHAnsi" w:hAnsiTheme="minorHAnsi" w:cstheme="minorHAnsi"/>
-        </w:rPr>
-        <w:t xml:space="preserve">Players with higher trailing WAR generally went on to produce more Game Value, particularly among forwards. That gives some support to the model’s starting estimate of production. </w:t>
-      </w:r>
-    </w:p>
-    <w:p>
-      <w:pPr>
-        <w:rPr>
-          <w:rFonts w:asciiTheme="minorHAnsi" w:hAnsiTheme="minorHAnsi" w:cstheme="minorHAnsi"/>
-        </w:rPr>
-      </w:pPr>
-      <w:r>
-        <w:rPr>
-          <w:rFonts w:asciiTheme="minorHAnsi" w:hAnsiTheme="minorHAnsi" w:cstheme="minorHAnsi"/>
-        </w:rPr>
-        <w:t>Game Value uses no Bacon inputs and shares no valuation model with Bacon WAR. Both measures nevertheless describe the same games. They are built differently, but some agreement is expected because they are measuring the same players’ performances.</w:t>
+      </w:pPr>
+      <w:r>
+        <w:t>8. A Second Use: Dividing a Traded Player's Season</w:t>
+      </w:r>
+    </w:p>
+    <w:p>
+      <w:pPr/>
+      <w:r>
+        <w:t>A player traded during the season produced value for two clubs, and the trade comparison needs each club's share. Bacon WAR gives only his season total. A split by games played assumes he contributed equally in each game, even if his play changed after the trade. A split by points captures only part of what WAR measures, because defensive play and on-ice contributions produce value without a point. Game Value counts shot quality for and against, and penalties, game by game, so it captures a broader share of that performance.</w:t>
+      </w:r>
+    </w:p>
+    <w:p>
+      <w:pPr/>
+      <w:r>
+        <w:t>The rule is to total the player's Game Value with each club and divide his Bacon WAR in those proportions. One problem remains before the rule can be used. Game Value can be negative. A season total near zero makes the shares extreme, and stints of opposite sign produce a negative share or a share above 100%. The rule needs an explicit treatment of those cases, and the division is not yet implemented.</w:t>
       </w:r>
     </w:p>
     <w:sectPr>
@@ -690,12 +775,6 @@
 
 <file path=word/styles.xml><?xml version="1.0" encoding="utf-8"?>
 <w:styles xmlns:mc="http://schemas.openxmlformats.org/markup-compatibility/2006" xmlns:r="http://schemas.openxmlformats.org/officeDocument/2006/relationships" xmlns:w="http://schemas.openxmlformats.org/wordprocessingml/2006/main" xmlns:w14="http://schemas.microsoft.com/office/word/2010/wordml" xmlns:w15="http://schemas.microsoft.com/office/word/2012/wordml" xmlns:w16cex="http://schemas.microsoft.com/office/word/2018/wordml/cex" xmlns:w16cid="http://schemas.microsoft.com/office/word/2016/wordml/cid" xmlns:w16="http://schemas.microsoft.com/office/word/2018/wordml" xmlns:w16du="http://schemas.microsoft.com/office/word/2023/wordml/word16du" xmlns:w16sdtdh="http://schemas.microsoft.com/office/word/2020/wordml/sdtdatahash" xmlns:w16sdtfl="http://schemas.microsoft.com/office/word/2024/wordml/sdtformatlock" xmlns:w16se="http://schemas.microsoft.com/office/word/2015/wordml/symex" mc:Ignorable="w14 w15 w16se w16cid w16 w16cex w16sdtdh w16sdtfl w16du">
-  <w:style w:type="paragraph" w:customStyle="1" w:styleId="Normal1">
-    <w:name w:val="Normal1"/>
-    <w:rPr>
-      <w:color w:val="000000"/>
-    </w:rPr>
-  </w:style>
   <w:docDefaults>
     <w:rPrDefault>
       <w:rPr>
@@ -1083,6 +1162,12 @@
     <w:lsdException w:name="Unresolved Mention" w:semiHidden="1" w:unhideWhenUsed="1"/>
     <w:lsdException w:name="Smart Link" w:semiHidden="1" w:unhideWhenUsed="1"/>
   </w:latentStyles>
+  <w:style w:type="paragraph" w:customStyle="1" w:styleId="Normal1">
+    <w:name w:val="Normal1"/>
+    <w:rPr>
+      <w:color w:val="000000"/>
+    </w:rPr>
+  </w:style>
   <w:style w:type="paragraph" w:default="1" w:styleId="Normal">
     <w:name w:val="Normal"/>
     <w:qFormat/>

</xml_diff>

<commit_message>
Rewrite the four supervisor documents for xNPV 1; flag late-signed contracts
The supervisor documents now describe xNPV 1 from its code, with the 2024
page's fitted tables and a worked contract; the xNPV 0 versions are archived.
Writing them found that a contract signed after July 1 cannot see itself in
its own chance of playing (+$622M across 1,530 contracts if read at the
signing; new 25_TESTS/late_signing_status_check.py), and that D33 described
the starting level wrongly (corrected in place). No model code changed.

Co-Authored-By: Claude Opus 5.5 <noreply@anthropic.com>
</commit_message>
<xml_diff>
--- a/40_DOCS/Supervisor_Drafts/Circularity and Game Value.docx
+++ b/40_DOCS/Supervisor_Drafts/Circularity and Game Value.docx
@@ -13,7 +13,7 @@
         <w:rPr>
           <w:rFonts w:asciiTheme="minorHAnsi" w:hAnsiTheme="minorHAnsi" w:cstheme="minorHAnsi"/>
         </w:rPr>
-        <w:t>Circularity and Game Value</w:t>
+        <w:t xml:space="preserve">Circularity and Game Value</w:t>
       </w:r>
     </w:p>
     <w:p>
@@ -40,57 +40,73 @@
         <w:rPr>
           <w:rFonts w:asciiTheme="minorHAnsi" w:hAnsiTheme="minorHAnsi" w:cstheme="minorHAnsi"/>
         </w:rPr>
-        <w:t>The circularity problem</w:t>
-      </w:r>
-    </w:p>
-    <w:p>
-      <w:pPr>
-        <w:rPr>
-          <w:rFonts w:asciiTheme="minorHAnsi" w:hAnsiTheme="minorHAnsi" w:cstheme="minorHAnsi"/>
-        </w:rPr>
-      </w:pPr>
-      <w:r>
-        <w:rPr>
-          <w:rFonts w:asciiTheme="minorHAnsi" w:hAnsiTheme="minorHAnsi" w:cstheme="minorHAnsi"/>
-        </w:rPr>
-        <w:t>The model estimates the price of a win from actual contract prices and players’ Bacon WAR. It then uses that rate to put a dollar value on production. Checking those valuations against another Bacon-based measure would leave both sides dependent on the same measure of performance. They could agree partly because they share assumptions or errors. Game Value provides a separate check on the production estimate.</w:t>
-      </w:r>
-    </w:p>
-    <w:p>
-      <w:pPr>
-        <w:rPr>
-          <w:rFonts w:asciiTheme="minorHAnsi" w:hAnsiTheme="minorHAnsi" w:cstheme="minorHAnsi"/>
-        </w:rPr>
-      </w:pPr>
-      <w:r>
-        <w:rPr>
-          <w:rFonts w:asciiTheme="minorHAnsi" w:hAnsiTheme="minorHAnsi" w:cstheme="minorHAnsi"/>
-        </w:rPr>
-        <w:t>Trailing production is a weighted blend of a player’s Bacon WAR from seasons before the valuation date, as explained in the</w:t>
-      </w:r>
-      <w:r>
-        <w:rPr>
-          <w:rFonts w:asciiTheme="minorHAnsi" w:hAnsiTheme="minorHAnsi" w:cstheme="minorHAnsi"/>
-        </w:rPr>
-        <w:t xml:space="preserve"> Data, Production, and Aging</w:t>
-      </w:r>
-      <w:r>
-        <w:rPr>
-          <w:rFonts w:asciiTheme="minorHAnsi" w:hAnsiTheme="minorHAnsi" w:cstheme="minorHAnsi"/>
-        </w:rPr>
-        <w:t xml:space="preserve"> document</w:t>
-      </w:r>
-      <w:r>
-        <w:rPr>
-          <w:rFonts w:asciiTheme="minorHAnsi" w:hAnsiTheme="minorHAnsi" w:cstheme="minorHAnsi"/>
-        </w:rPr>
-        <w:t xml:space="preserve">, which is then projected </w:t>
-      </w:r>
-      <w:r>
-        <w:rPr>
-          <w:rFonts w:asciiTheme="minorHAnsi" w:hAnsiTheme="minorHAnsi" w:cstheme="minorHAnsi"/>
-        </w:rPr>
-        <w:t>forward through an aging curve. The pricing document covers the market regression that converts production into dollars. The check here compares trailing production with subsequent performance.</w:t>
+        <w:t xml:space="preserve">1. The Circularity Problem</w:t>
+      </w:r>
+    </w:p>
+    <w:p>
+      <w:pPr>
+        <w:rPr>
+          <w:rFonts w:asciiTheme="minorHAnsi" w:hAnsiTheme="minorHAnsi" w:cstheme="minorHAnsi"/>
+        </w:rPr>
+      </w:pPr>
+      <w:r>
+        <w:rPr>
+          <w:rFonts w:asciiTheme="minorHAnsi" w:hAnsiTheme="minorHAnsi" w:cstheme="minorHAnsi"/>
+        </w:rPr>
+        <w:t xml:space="preserve">The model forecasts each player’s production from his Bacon WAR in seasons before the valuation date, as explained in the Data, Production, and Aging document. It estimates the price of a win from actual contract prices and that forecast, and then uses the price to put a dollar value on forecast production, as explained in the pricing document. Checking those valuations against another Bacon-based measure would leave both sides dependent on the same measure of performance. They could agree partly because they share assumptions or errors. Game Value provides a separate check on the production measure.</w:t>
+      </w:r>
+    </w:p>
+    <w:p>
+      <w:pPr>
+        <w:rPr>
+          <w:rFonts w:asciiTheme="minorHAnsi" w:hAnsiTheme="minorHAnsi" w:cstheme="minorHAnsi"/>
+        </w:rPr>
+      </w:pPr>
+      <w:r>
+        <w:rPr>
+          <w:rFonts w:asciiTheme="minorHAnsi" w:hAnsiTheme="minorHAnsi" w:cstheme="minorHAnsi"/>
+        </w:rPr>
+        <w:t xml:space="preserve">The check reported below compares a player’s trailing WAR, a weighted average of his Bacon WAR from the seasons before the valuation date, with his subsequent performance. It was run on the 60/40 two-season trailing total, which was the starting point of an earlier version of the model. The current forecast starts from a three-season trailing total and pulls it toward the league average, so the check tests the production measure the forecast is built from, not the forecast itself. It has not been repeated on the forecast.</w:t>
+      </w:r>
+    </w:p>
+    <w:p>
+      <w:pPr>
+        <w:pStyle w:val="Heading2"/>
+        <w:rPr>
+          <w:rFonts w:asciiTheme="minorHAnsi" w:hAnsiTheme="minorHAnsi" w:cstheme="minorHAnsi"/>
+        </w:rPr>
+      </w:pPr>
+      <w:r>
+        <w:rPr>
+          <w:rFonts w:asciiTheme="minorHAnsi" w:hAnsiTheme="minorHAnsi" w:cstheme="minorHAnsi"/>
+        </w:rPr>
+        <w:t xml:space="preserve">A second channel: contract status</w:t>
+      </w:r>
+    </w:p>
+    <w:p>
+      <w:pPr>
+        <w:rPr>
+          <w:rFonts w:asciiTheme="minorHAnsi" w:hAnsiTheme="minorHAnsi" w:cstheme="minorHAnsi"/>
+        </w:rPr>
+      </w:pPr>
+      <w:r>
+        <w:rPr>
+          <w:rFonts w:asciiTheme="minorHAnsi" w:hAnsiTheme="minorHAnsi" w:cstheme="minorHAnsi"/>
+        </w:rPr>
+        <w:t xml:space="preserve">The chance of playing also reads one decision made by clubs: whether the player is under contract for the season, counting only contracts signed on or before the valuation date. Being under contract raises the odds that a player plays a season by a factor of about 3.5. A contract’s value therefore depends in part on the commitments the club has already made to the player.</w:t>
+      </w:r>
+    </w:p>
+    <w:p>
+      <w:pPr>
+        <w:rPr>
+          <w:rFonts w:asciiTheme="minorHAnsi" w:hAnsiTheme="minorHAnsi" w:cstheme="minorHAnsi"/>
+        </w:rPr>
+      </w:pPr>
+      <w:r>
+        <w:rPr>
+          <w:rFonts w:asciiTheme="minorHAnsi" w:hAnsiTheme="minorHAnsi" w:cstheme="minorHAnsi"/>
+        </w:rPr>
+        <w:t xml:space="preserve">This is not look-ahead, because each contract counted was public on the valuation date. It does mean that information clubs act on when they sign a player, including what they may know privately, can reach the valuation through his chance of playing. The back-test judges clubs’ trades against these valuations, so this channel is stated here as a possible source of agreement between the model and the market. The production forecast and the price line read no contract information; contract status enters through the chance of playing only.</w:t>
       </w:r>
     </w:p>
     <w:p>
@@ -104,246 +120,111 @@
         <w:rPr>
           <w:rFonts w:asciiTheme="minorHAnsi" w:hAnsiTheme="minorHAnsi" w:cstheme="minorHAnsi"/>
         </w:rPr>
-        <w:t>How Game Value is calculated</w:t>
-      </w:r>
-    </w:p>
-    <w:p>
-      <w:pPr>
-        <w:rPr>
-          <w:rFonts w:asciiTheme="minorHAnsi" w:hAnsiTheme="minorHAnsi" w:cstheme="minorHAnsi"/>
-        </w:rPr>
-      </w:pPr>
-      <w:r>
-        <w:rPr>
-          <w:rFonts w:asciiTheme="minorHAnsi" w:hAnsiTheme="minorHAnsi" w:cstheme="minorHAnsi"/>
-        </w:rPr>
-        <w:t>Game Value uses the NHL’s shot, penalty, and shift records. Shots are described by their location, type, and manpower situation. Shift records identify which skaters were on the ice when each event occurred. The shot model includes unblocked attempts with a goaltender in net; blocked shots, empty-net attempts, and shootouts are excluded.</w:t>
-      </w:r>
-      <w:r>
-        <w:rPr>
-          <w:rFonts w:asciiTheme="minorHAnsi" w:hAnsiTheme="minorHAnsi" w:cstheme="minorHAnsi"/>
-        </w:rPr>
-        <w:t xml:space="preserve"> Importantly, Game Value is calculated and stored on a </w:t>
-      </w:r>
-      <w:r>
-        <w:rPr>
-          <w:rFonts w:asciiTheme="minorHAnsi" w:hAnsiTheme="minorHAnsi" w:cstheme="minorHAnsi"/>
-        </w:rPr>
-        <w:t>game-by-game</w:t>
-      </w:r>
-      <w:r>
-        <w:rPr>
-          <w:rFonts w:asciiTheme="minorHAnsi" w:hAnsiTheme="minorHAnsi" w:cstheme="minorHAnsi"/>
-        </w:rPr>
-        <w:t xml:space="preserve"> basis. </w:t>
-      </w:r>
-      <w:r>
-        <w:rPr>
-          <w:rFonts w:asciiTheme="minorHAnsi" w:hAnsiTheme="minorHAnsi" w:cstheme="minorHAnsi"/>
-        </w:rPr>
-        <w:t xml:space="preserve">Bacon WAR </w:t>
-      </w:r>
-      <w:r>
-        <w:rPr>
-          <w:rFonts w:asciiTheme="minorHAnsi" w:hAnsiTheme="minorHAnsi" w:cstheme="minorHAnsi"/>
-        </w:rPr>
-        <w:t xml:space="preserve">is not made available </w:t>
-      </w:r>
-      <w:r>
-        <w:rPr>
-          <w:rFonts w:asciiTheme="minorHAnsi" w:hAnsiTheme="minorHAnsi" w:cstheme="minorHAnsi"/>
-        </w:rPr>
-        <w:t xml:space="preserve">for individual games </w:t>
-      </w:r>
-      <w:r>
-        <w:rPr>
-          <w:rFonts w:asciiTheme="minorHAnsi" w:hAnsiTheme="minorHAnsi" w:cstheme="minorHAnsi"/>
-        </w:rPr>
-        <w:t xml:space="preserve">and only aggregate season-level </w:t>
-      </w:r>
-      <w:r>
-        <w:rPr>
-          <w:rFonts w:asciiTheme="minorHAnsi" w:hAnsiTheme="minorHAnsi" w:cstheme="minorHAnsi"/>
-        </w:rPr>
-        <w:t xml:space="preserve">WAR </w:t>
-      </w:r>
-      <w:r>
-        <w:rPr>
-          <w:rFonts w:asciiTheme="minorHAnsi" w:hAnsiTheme="minorHAnsi" w:cstheme="minorHAnsi"/>
-        </w:rPr>
-        <w:t>is.</w:t>
-      </w:r>
-    </w:p>
-    <w:p>
-      <w:pPr>
-        <w:rPr>
-          <w:rFonts w:asciiTheme="minorHAnsi" w:hAnsiTheme="minorHAnsi" w:cstheme="minorHAnsi"/>
-        </w:rPr>
-      </w:pPr>
-      <w:r>
-        <w:rPr>
-          <w:rFonts w:asciiTheme="minorHAnsi" w:hAnsiTheme="minorHAnsi" w:cstheme="minorHAnsi"/>
-        </w:rPr>
-        <w:t xml:space="preserve">Each included shot receives an expected-goals value, or </w:t>
-      </w:r>
-      <w:proofErr w:type="spellStart"/>
-      <w:r>
-        <w:rPr>
-          <w:rFonts w:asciiTheme="minorHAnsi" w:hAnsiTheme="minorHAnsi" w:cstheme="minorHAnsi"/>
-        </w:rPr>
-        <w:t>xG</w:t>
-      </w:r>
-      <w:proofErr w:type="spellEnd"/>
-      <w:r>
-        <w:rPr>
-          <w:rFonts w:asciiTheme="minorHAnsi" w:hAnsiTheme="minorHAnsi" w:cstheme="minorHAnsi"/>
-        </w:rPr>
-        <w:t xml:space="preserve">, which is its estimated probability of becoming a goal. A distant shot from a bad angle might have an </w:t>
-      </w:r>
-      <w:proofErr w:type="spellStart"/>
-      <w:r>
-        <w:rPr>
-          <w:rFonts w:asciiTheme="minorHAnsi" w:hAnsiTheme="minorHAnsi" w:cstheme="minorHAnsi"/>
-        </w:rPr>
-        <w:t>xG</w:t>
-      </w:r>
-      <w:proofErr w:type="spellEnd"/>
-      <w:r>
-        <w:rPr>
-          <w:rFonts w:asciiTheme="minorHAnsi" w:hAnsiTheme="minorHAnsi" w:cstheme="minorHAnsi"/>
-        </w:rPr>
-        <w:t xml:space="preserve"> of 0.03, meaning a 3% chance of scoring; a chance from the slot might have an </w:t>
-      </w:r>
-      <w:proofErr w:type="spellStart"/>
-      <w:r>
-        <w:rPr>
-          <w:rFonts w:asciiTheme="minorHAnsi" w:hAnsiTheme="minorHAnsi" w:cstheme="minorHAnsi"/>
-        </w:rPr>
-        <w:t>xG</w:t>
-      </w:r>
-      <w:proofErr w:type="spellEnd"/>
-      <w:r>
-        <w:rPr>
-          <w:rFonts w:asciiTheme="minorHAnsi" w:hAnsiTheme="minorHAnsi" w:cstheme="minorHAnsi"/>
-        </w:rPr>
-        <w:t xml:space="preserve"> of 0.25. A logistic regression estimates these probabilities from distance, angle, shot type, manpower situation, and whether the shot was a rebound.</w:t>
-      </w:r>
-    </w:p>
-    <w:p>
-      <w:pPr>
-        <w:rPr>
-          <w:rFonts w:asciiTheme="minorHAnsi" w:hAnsiTheme="minorHAnsi" w:cstheme="minorHAnsi"/>
-        </w:rPr>
-      </w:pPr>
-      <w:r>
-        <w:rPr>
-          <w:rFonts w:asciiTheme="minorHAnsi" w:hAnsiTheme="minorHAnsi" w:cstheme="minorHAnsi"/>
-        </w:rPr>
-        <w:t>Strength state distinguishes even strength, power plays, and shorthanded play, and is already included in the shot model. Score state distinguishes teams that are leading, trailing, or tied. Trailing teams tend to press for goals and generate more shots, while leading teams tend to defend and generate fewer. At even strength, the score adjustment reduces the weight of chances created while trailing and increases it while leading. Power-play and shorthanded chances receive no score adjustment.</w:t>
-      </w:r>
-    </w:p>
-    <w:p>
-      <w:pPr>
-        <w:rPr>
-          <w:rFonts w:asciiTheme="minorHAnsi" w:hAnsiTheme="minorHAnsi" w:cstheme="minorHAnsi"/>
-        </w:rPr>
-      </w:pPr>
-      <w:r>
-        <w:rPr>
-          <w:rFonts w:asciiTheme="minorHAnsi" w:hAnsiTheme="minorHAnsi" w:cstheme="minorHAnsi"/>
-        </w:rPr>
-        <w:t>Each adjusted chance is divided equally among the attacking skaters on the ice and charged equally to the defending skaters. The total credit and debit are equal, although the share per player differs when the teams have different numbers of skaters. For example, on a five-on-four chance, each attacker receives one-fifth of the credit and each penalty killer receives one-quarter of the debit.</w:t>
-      </w:r>
-      <w:r>
-        <w:rPr>
-          <w:rFonts w:asciiTheme="minorHAnsi" w:hAnsiTheme="minorHAnsi" w:cstheme="minorHAnsi"/>
-        </w:rPr>
-        <w:t xml:space="preserve"> </w:t>
-      </w:r>
-      <w:r>
-        <w:rPr>
-          <w:rFonts w:asciiTheme="minorHAnsi" w:hAnsiTheme="minorHAnsi" w:cstheme="minorHAnsi"/>
-        </w:rPr>
-        <w:t>The metric covers 11,870 games from 2017-18 through 2025-26. Across the league, the on-ice credits and debits sum to zero.</w:t>
-      </w:r>
-    </w:p>
-    <w:p>
-      <w:pPr>
-        <w:rPr>
-          <w:rFonts w:asciiTheme="minorHAnsi" w:hAnsiTheme="minorHAnsi" w:cstheme="minorHAnsi"/>
-        </w:rPr>
-      </w:pPr>
-      <w:r>
-        <w:rPr>
-          <w:rFonts w:asciiTheme="minorHAnsi" w:hAnsiTheme="minorHAnsi" w:cstheme="minorHAnsi"/>
-        </w:rPr>
-        <w:t xml:space="preserve">Penalties are valued separately. Drawing an eligible penalty earns the estimated net goal value of a power play; taking one incurs the same debit. That value is estimated from regular-season power-play goals minus shorthanded goals, divided by eligible penalties. Coincidental penalties and misconducts are </w:t>
-      </w:r>
-      <w:r>
-        <w:rPr>
-          <w:rFonts w:asciiTheme="minorHAnsi" w:hAnsiTheme="minorHAnsi" w:cstheme="minorHAnsi"/>
-        </w:rPr>
-        <w:lastRenderedPageBreak/>
-        <w:t>excluded. A player’s on-ice and penalty totals are added for each game. The result is Game Value, measured in goals.</w:t>
-      </w:r>
-      <w:r>
-        <w:rPr>
-          <w:rFonts w:asciiTheme="minorHAnsi" w:hAnsiTheme="minorHAnsi" w:cstheme="minorHAnsi"/>
-        </w:rPr>
-        <w:t xml:space="preserve"> </w:t>
-      </w:r>
-    </w:p>
-    <w:p>
-      <w:pPr>
-        <w:rPr>
-          <w:rFonts w:asciiTheme="minorHAnsi" w:hAnsiTheme="minorHAnsi" w:cstheme="minorHAnsi"/>
-        </w:rPr>
-      </w:pPr>
-      <w:r>
-        <w:rPr>
-          <w:rFonts w:asciiTheme="minorHAnsi" w:hAnsiTheme="minorHAnsi" w:cstheme="minorHAnsi"/>
-        </w:rPr>
-        <w:t>The second check compares team Game Value with actual goal differential. Game Value assigns credit for expected goals, so a good chance contributes value even when the shot misses or is saved. The scoreboard records only goals that went in. A team can therefore generate more Game Value and still lose, and agreement between the two is not guaranteed by the allocation formula.</w:t>
-      </w:r>
-    </w:p>
-    <w:p>
-      <w:pPr>
-        <w:rPr>
-          <w:rFonts w:asciiTheme="minorHAnsi" w:hAnsiTheme="minorHAnsi" w:cstheme="minorHAnsi"/>
-        </w:rPr>
-      </w:pPr>
-      <w:r>
-        <w:rPr>
-          <w:rFonts w:asciiTheme="minorHAnsi" w:hAnsiTheme="minorHAnsi" w:cstheme="minorHAnsi"/>
-        </w:rPr>
-        <w:t xml:space="preserve">Game Value explains 3.4% of the variation in goal differential between individual games. For context, a development check using </w:t>
-      </w:r>
-      <w:proofErr w:type="spellStart"/>
-      <w:r>
-        <w:rPr>
-          <w:rFonts w:asciiTheme="minorHAnsi" w:hAnsiTheme="minorHAnsi" w:cstheme="minorHAnsi"/>
-        </w:rPr>
-        <w:t>MoneyPuck’s</w:t>
-      </w:r>
-      <w:proofErr w:type="spellEnd"/>
-      <w:r>
-        <w:rPr>
-          <w:rFonts w:asciiTheme="minorHAnsi" w:hAnsiTheme="minorHAnsi" w:cstheme="minorHAnsi"/>
-        </w:rPr>
-        <w:t xml:space="preserve"> 2023-24 shot files found that team-game expected goals explained about 7% of the variation in goals scored. The outcome and sample differ from Game Value, so this is a reference point rather than a direct comparison. It also shows that a low single-game figure is not unique to this model. Across full seasons, Game Value explains 58.3% of the variation in team goal differential.</w:t>
-      </w:r>
-    </w:p>
-    <w:p>
-      <w:pPr>
-        <w:rPr>
-          <w:rFonts w:asciiTheme="minorHAnsi" w:hAnsiTheme="minorHAnsi" w:cstheme="minorHAnsi"/>
-        </w:rPr>
-      </w:pPr>
-      <w:r>
-        <w:rPr>
-          <w:rFonts w:asciiTheme="minorHAnsi" w:hAnsiTheme="minorHAnsi" w:cstheme="minorHAnsi"/>
-        </w:rPr>
-        <w:t>An equal split cannot distinguish a player who drove a shift from a linemate who contributed little. Raw Game Value is therefore used for allocation and validation rather than as a standalone estimate of individual player value.</w:t>
+        <w:t xml:space="preserve">2. How Game Value Is Calculated</w:t>
+      </w:r>
+    </w:p>
+    <w:p>
+      <w:pPr>
+        <w:rPr>
+          <w:rFonts w:asciiTheme="minorHAnsi" w:hAnsiTheme="minorHAnsi" w:cstheme="minorHAnsi"/>
+        </w:rPr>
+      </w:pPr>
+      <w:r>
+        <w:rPr>
+          <w:rFonts w:asciiTheme="minorHAnsi" w:hAnsiTheme="minorHAnsi" w:cstheme="minorHAnsi"/>
+        </w:rPr>
+        <w:t xml:space="preserve">Game Value uses the NHL’s shot, penalty, and shift records. Shots are described by their location, type, and manpower situation. Shift records identify which skaters were on the ice when each event occurred. The shot model includes unblocked attempts with a goaltender in net; blocked shots, empty-net attempts, and shootouts are excluded. Importantly, Game Value is calculated and stored on a game-by-game basis. Bacon WAR is not made available for individual games and only aggregate season-level WAR is.</w:t>
+      </w:r>
+    </w:p>
+    <w:p>
+      <w:pPr>
+        <w:rPr>
+          <w:rFonts w:asciiTheme="minorHAnsi" w:hAnsiTheme="minorHAnsi" w:cstheme="minorHAnsi"/>
+        </w:rPr>
+      </w:pPr>
+      <w:r>
+        <w:rPr>
+          <w:rFonts w:asciiTheme="minorHAnsi" w:hAnsiTheme="minorHAnsi" w:cstheme="minorHAnsi"/>
+        </w:rPr>
+        <w:t xml:space="preserve">Each included shot receives an expected-goals value, or xG, which is its estimated probability of becoming a goal. A distant shot from a bad angle might have an xG of 0.03, meaning a 3% chance of scoring; a chance from the slot might have an xG of 0.25. A logistic regression estimates these probabilities from distance, angle, shot type, manpower situation, and whether the shot was a rebound.</w:t>
+      </w:r>
+    </w:p>
+    <w:p>
+      <w:pPr>
+        <w:rPr>
+          <w:rFonts w:asciiTheme="minorHAnsi" w:hAnsiTheme="minorHAnsi" w:cstheme="minorHAnsi"/>
+        </w:rPr>
+      </w:pPr>
+      <w:r>
+        <w:rPr>
+          <w:rFonts w:asciiTheme="minorHAnsi" w:hAnsiTheme="minorHAnsi" w:cstheme="minorHAnsi"/>
+        </w:rPr>
+        <w:t xml:space="preserve">Strength state distinguishes even strength, power plays, and shorthanded play, and is already included in the shot model. Score state distinguishes teams that are leading, trailing, or tied. Trailing teams tend to press for goals and generate more shots, while leading teams tend to defend and generate fewer. At even strength, the score adjustment reduces the weight of chances created while trailing and increases it while leading. Power-play and shorthanded chances receive no score adjustment.</w:t>
+      </w:r>
+    </w:p>
+    <w:p>
+      <w:pPr>
+        <w:rPr>
+          <w:rFonts w:asciiTheme="minorHAnsi" w:hAnsiTheme="minorHAnsi" w:cstheme="minorHAnsi"/>
+        </w:rPr>
+      </w:pPr>
+      <w:r>
+        <w:rPr>
+          <w:rFonts w:asciiTheme="minorHAnsi" w:hAnsiTheme="minorHAnsi" w:cstheme="minorHAnsi"/>
+        </w:rPr>
+        <w:t xml:space="preserve">Each adjusted chance is divided equally among the attacking skaters on the ice and charged equally to the defending skaters. The total credit and debit are equal, although the share per player differs when the teams have different numbers of skaters. For example, on a five-on-four chance, each attacker receives one-fifth of the credit and each penalty killer receives one-quarter of the debit. The metric covers 11,870 games from 2017-18 through 2025-26. Across the league, the on-ice credits and debits sum to zero.</w:t>
+      </w:r>
+    </w:p>
+    <w:p>
+      <w:pPr>
+        <w:rPr>
+          <w:rFonts w:asciiTheme="minorHAnsi" w:hAnsiTheme="minorHAnsi" w:cstheme="minorHAnsi"/>
+        </w:rPr>
+      </w:pPr>
+      <w:r>
+        <w:rPr>
+          <w:rFonts w:asciiTheme="minorHAnsi" w:hAnsiTheme="minorHAnsi" w:cstheme="minorHAnsi"/>
+        </w:rPr>
+        <w:t xml:space="preserve">Penalties are valued separately. Drawing an eligible penalty earns the estimated net goal value of a power play; taking one incurs the same debit. That value is estimated from regular-season power-play goals minus shorthanded goals, divided by eligible penalties. Coincidental penalties and misconducts are excluded. A player’s on-ice and penalty totals are added for each game. The result is Game Value, measured in goals. </w:t>
+      </w:r>
+    </w:p>
+    <w:p>
+      <w:pPr>
+        <w:rPr>
+          <w:rFonts w:asciiTheme="minorHAnsi" w:hAnsiTheme="minorHAnsi" w:cstheme="minorHAnsi"/>
+        </w:rPr>
+      </w:pPr>
+      <w:r>
+        <w:rPr>
+          <w:rFonts w:asciiTheme="minorHAnsi" w:hAnsiTheme="minorHAnsi" w:cstheme="minorHAnsi"/>
+        </w:rPr>
+        <w:t xml:space="preserve">The second check compares team Game Value with actual goal differential. Game Value assigns credit for expected goals, so a good chance contributes value even when the shot misses or is saved. The scoreboard records only goals that went in. A team can therefore generate more Game Value and still lose, and agreement between the two is not guaranteed by the allocation formula.</w:t>
+      </w:r>
+    </w:p>
+    <w:p>
+      <w:pPr>
+        <w:rPr>
+          <w:rFonts w:asciiTheme="minorHAnsi" w:hAnsiTheme="minorHAnsi" w:cstheme="minorHAnsi"/>
+        </w:rPr>
+      </w:pPr>
+      <w:r>
+        <w:rPr>
+          <w:rFonts w:asciiTheme="minorHAnsi" w:hAnsiTheme="minorHAnsi" w:cstheme="minorHAnsi"/>
+        </w:rPr>
+        <w:t xml:space="preserve">Game Value explains 3.4% of the variation in goal differential between individual games. For context, a development check using MoneyPuck’s 2023-24 shot files found that team-game expected goals explained about 7% of the variation in goals scored. The outcome and sample differ from Game Value, so this is a reference point rather than a direct comparison. It also shows that a low single-game figure is not unique to this model. Across full seasons, Game Value explains 58.3% of the variation in team goal differential.</w:t>
+      </w:r>
+    </w:p>
+    <w:p>
+      <w:pPr>
+        <w:rPr>
+          <w:rFonts w:asciiTheme="minorHAnsi" w:hAnsiTheme="minorHAnsi" w:cstheme="minorHAnsi"/>
+        </w:rPr>
+      </w:pPr>
+      <w:r>
+        <w:rPr>
+          <w:rFonts w:asciiTheme="minorHAnsi" w:hAnsiTheme="minorHAnsi" w:cstheme="minorHAnsi"/>
+        </w:rPr>
+        <w:t xml:space="preserve">An equal split cannot distinguish a player who drove a shift from a linemate who contributed little. Raw Game Value is therefore used for allocation and validation rather than as a standalone estimate of individual player value.</w:t>
       </w:r>
     </w:p>
     <w:p>
@@ -357,33 +238,33 @@
         <w:rPr>
           <w:rFonts w:asciiTheme="minorHAnsi" w:hAnsiTheme="minorHAnsi" w:cstheme="minorHAnsi"/>
         </w:rPr>
-        <w:t>Why the model retains Bacon WAR</w:t>
-      </w:r>
-    </w:p>
-    <w:p>
-      <w:pPr>
-        <w:rPr>
-          <w:rFonts w:asciiTheme="minorHAnsi" w:hAnsiTheme="minorHAnsi" w:cstheme="minorHAnsi"/>
-        </w:rPr>
-      </w:pPr>
-      <w:r>
-        <w:rPr>
-          <w:rFonts w:asciiTheme="minorHAnsi" w:hAnsiTheme="minorHAnsi" w:cstheme="minorHAnsi"/>
-        </w:rPr>
-        <w:t>An adjusted version, GV-adj, was tested as a possible replacement for Bacon WAR. At five-on-five, it uses lineup changes to separate a player’s contribution from the effects of teammates and opponents, while accounting for deployment. Other strength situations retain the equal split. GV-adj also includes penalties and goals scored above expected, with finishing estimates pulled toward zero when the evidence is weak.</w:t>
-      </w:r>
-    </w:p>
-    <w:p>
-      <w:pPr>
-        <w:rPr>
-          <w:rFonts w:asciiTheme="minorHAnsi" w:hAnsiTheme="minorHAnsi" w:cstheme="minorHAnsi"/>
-        </w:rPr>
-      </w:pPr>
-      <w:r>
-        <w:rPr>
-          <w:rFonts w:asciiTheme="minorHAnsi" w:hAnsiTheme="minorHAnsi" w:cstheme="minorHAnsi"/>
-        </w:rPr>
-        <w:t>GV-adj came closer to Bacon’s results for forwards than for defencemen. Play-by-play data offer limited information about defensive contributions that prevent chances from developing, which may explain part of the gap. The comparison cannot tell us which metric measures defensive value more accurately. The model retains Bacon WAR for skater valuation.</w:t>
+        <w:t xml:space="preserve">3. Why the Model Retains Bacon WAR</w:t>
+      </w:r>
+    </w:p>
+    <w:p>
+      <w:pPr>
+        <w:rPr>
+          <w:rFonts w:asciiTheme="minorHAnsi" w:hAnsiTheme="minorHAnsi" w:cstheme="minorHAnsi"/>
+        </w:rPr>
+      </w:pPr>
+      <w:r>
+        <w:rPr>
+          <w:rFonts w:asciiTheme="minorHAnsi" w:hAnsiTheme="minorHAnsi" w:cstheme="minorHAnsi"/>
+        </w:rPr>
+        <w:t xml:space="preserve">An adjusted version, GV-adj, was tested as a possible replacement for Bacon WAR. At five-on-five, it uses lineup changes to separate a player’s contribution from the effects of teammates and opponents, while accounting for deployment. Other strength situations retain the equal split. GV-adj also includes penalties and goals scored above expected, with finishing estimates pulled toward zero when the evidence is weak.</w:t>
+      </w:r>
+    </w:p>
+    <w:p>
+      <w:pPr>
+        <w:rPr>
+          <w:rFonts w:asciiTheme="minorHAnsi" w:hAnsiTheme="minorHAnsi" w:cstheme="minorHAnsi"/>
+        </w:rPr>
+      </w:pPr>
+      <w:r>
+        <w:rPr>
+          <w:rFonts w:asciiTheme="minorHAnsi" w:hAnsiTheme="minorHAnsi" w:cstheme="minorHAnsi"/>
+        </w:rPr>
+        <w:t xml:space="preserve">GV-adj came closer to Bacon’s results for forwards than for defencemen. Play-by-play data offer limited information about defensive contributions that prevent chances from developing, which may explain part of the gap. The comparison cannot tell us which metric measures defensive value more accurately. The model retains Bacon WAR for skater valuation.</w:t>
       </w:r>
     </w:p>
     <w:p>
@@ -397,94 +278,46 @@
         <w:rPr>
           <w:rFonts w:asciiTheme="minorHAnsi" w:hAnsiTheme="minorHAnsi" w:cstheme="minorHAnsi"/>
         </w:rPr>
-        <w:t>Allocating value after a midseason trade</w:t>
-      </w:r>
-    </w:p>
-    <w:p>
-      <w:pPr>
-        <w:rPr>
-          <w:rFonts w:asciiTheme="minorHAnsi" w:hAnsiTheme="minorHAnsi" w:cstheme="minorHAnsi"/>
-        </w:rPr>
-      </w:pPr>
-      <w:r>
-        <w:rPr>
-          <w:rFonts w:asciiTheme="minorHAnsi" w:hAnsiTheme="minorHAnsi" w:cstheme="minorHAnsi"/>
-        </w:rPr>
-        <w:t>For a player traded during the season, the model must divide his full-season Bacon WAR between teams. A split based on games played assumes he contributed equally in every game, even if his performance changed after the trade.</w:t>
-      </w:r>
-    </w:p>
-    <w:p>
-      <w:pPr>
-        <w:rPr>
-          <w:rFonts w:asciiTheme="minorHAnsi" w:hAnsiTheme="minorHAnsi" w:cstheme="minorHAnsi"/>
-        </w:rPr>
-      </w:pPr>
-      <w:r>
-        <w:rPr>
-          <w:rFonts w:asciiTheme="minorHAnsi" w:hAnsiTheme="minorHAnsi" w:cstheme="minorHAnsi"/>
-        </w:rPr>
-        <w:t>Points offer more detail, but capture only part of what WAR measures. Defensive play and on-ice contributions can produce value without a point for the player. Dividing WAR by points would assign too much weight to games in which he scored and too little to contributions outside the scoresheet. Game Value uses shot quality and penalties to capture a broader share of that performance.</w:t>
-      </w:r>
-    </w:p>
-    <w:p>
-      <w:pPr>
-        <w:rPr>
-          <w:rFonts w:asciiTheme="minorHAnsi" w:hAnsiTheme="minorHAnsi" w:cstheme="minorHAnsi"/>
-        </w:rPr>
-      </w:pPr>
-      <w:r>
-        <w:rPr>
-          <w:rFonts w:asciiTheme="minorHAnsi" w:hAnsiTheme="minorHAnsi" w:cstheme="minorHAnsi"/>
-        </w:rPr>
-        <w:t>To allocate value for players traded mid-season,</w:t>
-      </w:r>
-      <w:r>
-        <w:rPr>
-          <w:rFonts w:asciiTheme="minorHAnsi" w:hAnsiTheme="minorHAnsi" w:cstheme="minorHAnsi"/>
-        </w:rPr>
-        <w:t xml:space="preserve"> we find the Game Value total for a given player for each team he played for during that season and allocate Bacon WAR according to those proportions.</w:t>
-      </w:r>
-      <w:r>
-        <w:rPr>
-          <w:rFonts w:asciiTheme="minorHAnsi" w:hAnsiTheme="minorHAnsi" w:cstheme="minorHAnsi"/>
-        </w:rPr>
-        <w:t xml:space="preserve"> </w:t>
-      </w:r>
-      <w:r>
-        <w:rPr>
-          <w:rFonts w:asciiTheme="minorHAnsi" w:hAnsiTheme="minorHAnsi" w:cstheme="minorHAnsi"/>
-        </w:rPr>
-        <w:t xml:space="preserve">Needed still </w:t>
-      </w:r>
-      <w:r>
-        <w:rPr>
-          <w:rFonts w:asciiTheme="minorHAnsi" w:hAnsiTheme="minorHAnsi" w:cstheme="minorHAnsi"/>
-        </w:rPr>
-        <w:t>a</w:t>
-      </w:r>
-      <w:r>
-        <w:rPr>
-          <w:rFonts w:asciiTheme="minorHAnsi" w:hAnsiTheme="minorHAnsi" w:cstheme="minorHAnsi"/>
-        </w:rPr>
-        <w:t>re</w:t>
-      </w:r>
-      <w:r>
-        <w:rPr>
-          <w:rFonts w:asciiTheme="minorHAnsi" w:hAnsiTheme="minorHAnsi" w:cstheme="minorHAnsi"/>
-        </w:rPr>
-        <w:t xml:space="preserve"> rule</w:t>
-      </w:r>
-      <w:r>
-        <w:rPr>
-          <w:rFonts w:asciiTheme="minorHAnsi" w:hAnsiTheme="minorHAnsi" w:cstheme="minorHAnsi"/>
-        </w:rPr>
-        <w:t>s</w:t>
-      </w:r>
-      <w:r>
-        <w:rPr>
-          <w:rFonts w:asciiTheme="minorHAnsi" w:hAnsiTheme="minorHAnsi" w:cstheme="minorHAnsi"/>
-        </w:rPr>
-        <w:t xml:space="preserve"> for seasons with near-zero Game Value or team stints with opposite signs.</w:t>
+        <w:t xml:space="preserve">4. Allocating Value after a Midseason Trade</w:t>
+      </w:r>
+    </w:p>
+    <w:p>
+      <w:pPr>
+        <w:rPr>
+          <w:rFonts w:asciiTheme="minorHAnsi" w:hAnsiTheme="minorHAnsi" w:cstheme="minorHAnsi"/>
+        </w:rPr>
+      </w:pPr>
+      <w:r>
+        <w:rPr>
+          <w:rFonts w:asciiTheme="minorHAnsi" w:hAnsiTheme="minorHAnsi" w:cstheme="minorHAnsi"/>
+        </w:rPr>
+        <w:t xml:space="preserve">For a player traded during the season, the model must divide his full-season Bacon WAR between teams. A split based on games played assumes he contributed equally in every game, even if his performance changed after the trade.</w:t>
+      </w:r>
+    </w:p>
+    <w:p>
+      <w:pPr>
+        <w:rPr>
+          <w:rFonts w:asciiTheme="minorHAnsi" w:hAnsiTheme="minorHAnsi" w:cstheme="minorHAnsi"/>
+        </w:rPr>
+      </w:pPr>
+      <w:r>
+        <w:rPr>
+          <w:rFonts w:asciiTheme="minorHAnsi" w:hAnsiTheme="minorHAnsi" w:cstheme="minorHAnsi"/>
+        </w:rPr>
+        <w:t xml:space="preserve">Points offer more detail, but capture only part of what WAR measures. Defensive play and on-ice contributions can produce value without a point for the player. Dividing WAR by points would assign too much weight to games in which he scored and too little to contributions outside the scoresheet. Game Value uses shot quality and penalties to capture a broader share of that performance.</w:t>
+      </w:r>
+    </w:p>
+    <w:p>
+      <w:pPr>
+        <w:rPr>
+          <w:rFonts w:asciiTheme="minorHAnsi" w:hAnsiTheme="minorHAnsi" w:cstheme="minorHAnsi"/>
+        </w:rPr>
+      </w:pPr>
+      <w:r>
+        <w:rPr>
+          <w:rFonts w:asciiTheme="minorHAnsi" w:hAnsiTheme="minorHAnsi" w:cstheme="minorHAnsi"/>
+        </w:rPr>
+        <w:t xml:space="preserve">To allocate value for players traded mid-season, we find the Game Value total for a given player for each team he played for during that season and allocate Bacon WAR according to those proportions. Needed still are rules for seasons with near-zero Game Value or team stints with opposite signs.</w:t>
       </w:r>
     </w:p>
     <w:p>
@@ -498,47 +331,46 @@
         <w:rPr>
           <w:rFonts w:asciiTheme="minorHAnsi" w:hAnsiTheme="minorHAnsi" w:cstheme="minorHAnsi"/>
         </w:rPr>
-        <w:lastRenderedPageBreak/>
-        <w:t>Results of the circularity check</w:t>
-      </w:r>
-    </w:p>
-    <w:p>
-      <w:pPr>
-        <w:rPr>
-          <w:rFonts w:asciiTheme="minorHAnsi" w:hAnsiTheme="minorHAnsi" w:cstheme="minorHAnsi"/>
-        </w:rPr>
-      </w:pPr>
-      <w:r>
-        <w:rPr>
-          <w:rFonts w:asciiTheme="minorHAnsi" w:hAnsiTheme="minorHAnsi" w:cstheme="minorHAnsi"/>
-        </w:rPr>
-        <w:t>The main check compares each player’s trailing WAR, calculated before the season, with his performance that season according to GV-adj. Both sides are measured in wins: Bacon WAR is already in win units, and GV-adj is converted from goals to wins. Across 6,027 player-seasons, the correlation was 0.576. It ranged from 0.55 to 0.61 in each of the nine seasons, suggesting that no single season drove the result. Comparing the same trailing estimate with performance one season further ahead gave a correlation of 0.538.</w:t>
-      </w:r>
-    </w:p>
-    <w:p>
-      <w:pPr>
-        <w:rPr>
-          <w:rFonts w:asciiTheme="minorHAnsi" w:hAnsiTheme="minorHAnsi" w:cstheme="minorHAnsi"/>
-        </w:rPr>
-      </w:pPr>
-      <w:r>
-        <w:rPr>
-          <w:rFonts w:asciiTheme="minorHAnsi" w:hAnsiTheme="minorHAnsi" w:cstheme="minorHAnsi"/>
-        </w:rPr>
-        <w:t>Two checks used raw Game Value. One measured performance above a replacement-level baseline, the reference point used by Bacon WAR. The other retained the zero-sum allocation, in which player contributions sum to the team’s total. Their correlations with trailing WAR were 0.609 and 0.564, respectively. Both were stable across seasons and weakened slightly at the later horizon. These are variants built from the same games, so their agreement shows that the result does not depend entirely on the GV-adj adjustments.</w:t>
-      </w:r>
-    </w:p>
-    <w:p>
-      <w:pPr>
-        <w:rPr>
-          <w:rFonts w:asciiTheme="minorHAnsi" w:hAnsiTheme="minorHAnsi" w:cstheme="minorHAnsi"/>
-        </w:rPr>
-      </w:pPr>
-      <w:r>
-        <w:rPr>
-          <w:rFonts w:asciiTheme="minorHAnsi" w:hAnsiTheme="minorHAnsi" w:cstheme="minorHAnsi"/>
-        </w:rPr>
-        <w:t>The main correlation was 0.648 for forwards and 0.302 for defencemen. The replacement-based raw variant gave a higher defensive correlation of 0.442, but the rebase can inflate that figure. The other two versions put the defensive correlation closer to 0.28-0.30.</w:t>
+        <w:t xml:space="preserve">5. Results of the Circularity Check</w:t>
+      </w:r>
+    </w:p>
+    <w:p>
+      <w:pPr>
+        <w:rPr>
+          <w:rFonts w:asciiTheme="minorHAnsi" w:hAnsiTheme="minorHAnsi" w:cstheme="minorHAnsi"/>
+        </w:rPr>
+      </w:pPr>
+      <w:r>
+        <w:rPr>
+          <w:rFonts w:asciiTheme="minorHAnsi" w:hAnsiTheme="minorHAnsi" w:cstheme="minorHAnsi"/>
+        </w:rPr>
+        <w:t xml:space="preserve">The main check compares each player’s 60/40 trailing WAR, calculated before the season, with his performance that season according to GV-adj. Both sides are measured in wins: Bacon WAR is already in win units, and GV-adj is converted from goals to wins. Across 6,027 player-seasons, the correlation was 0.576. It ranged from 0.55 to 0.61 in each of the nine seasons, suggesting that no single season drove the result. Comparing the same trailing estimate with performance one season further ahead gave a correlation of 0.538.</w:t>
+      </w:r>
+    </w:p>
+    <w:p>
+      <w:pPr>
+        <w:rPr>
+          <w:rFonts w:asciiTheme="minorHAnsi" w:hAnsiTheme="minorHAnsi" w:cstheme="minorHAnsi"/>
+        </w:rPr>
+      </w:pPr>
+      <w:r>
+        <w:rPr>
+          <w:rFonts w:asciiTheme="minorHAnsi" w:hAnsiTheme="minorHAnsi" w:cstheme="minorHAnsi"/>
+        </w:rPr>
+        <w:t xml:space="preserve">Two checks used raw Game Value. One measured performance above a replacement-level baseline, the reference point used by Bacon WAR. The other retained the zero-sum allocation, in which player contributions sum to the team’s total. Their correlations with trailing WAR were 0.609 and 0.564, respectively. Both were stable across seasons and weakened slightly at the later horizon. These are variants built from the same games, so their agreement shows that the result does not depend entirely on the GV-adj adjustments.</w:t>
+      </w:r>
+    </w:p>
+    <w:p>
+      <w:pPr>
+        <w:rPr>
+          <w:rFonts w:asciiTheme="minorHAnsi" w:hAnsiTheme="minorHAnsi" w:cstheme="minorHAnsi"/>
+        </w:rPr>
+      </w:pPr>
+      <w:r>
+        <w:rPr>
+          <w:rFonts w:asciiTheme="minorHAnsi" w:hAnsiTheme="minorHAnsi" w:cstheme="minorHAnsi"/>
+        </w:rPr>
+        <w:t xml:space="preserve">The main correlation was 0.648 for forwards and 0.302 for defencemen. The replacement-based raw variant gave a higher defensive correlation of 0.442, but the rebase can inflate that figure. The other two versions put the defensive correlation closer to 0.28-0.30.</w:t>
       </w:r>
     </w:p>
     <w:p>
@@ -552,33 +384,33 @@
         <w:rPr>
           <w:rFonts w:asciiTheme="minorHAnsi" w:hAnsiTheme="minorHAnsi" w:cstheme="minorHAnsi"/>
         </w:rPr>
-        <w:t>What the results establish</w:t>
-      </w:r>
-    </w:p>
-    <w:p>
-      <w:pPr>
-        <w:rPr>
-          <w:rFonts w:asciiTheme="minorHAnsi" w:hAnsiTheme="minorHAnsi" w:cstheme="minorHAnsi"/>
-        </w:rPr>
-      </w:pPr>
-      <w:r>
-        <w:rPr>
-          <w:rFonts w:asciiTheme="minorHAnsi" w:hAnsiTheme="minorHAnsi" w:cstheme="minorHAnsi"/>
-        </w:rPr>
-        <w:t xml:space="preserve">Players with higher trailing WAR generally went on to produce more Game Value, particularly among forwards. That gives some support to the model’s starting estimate of production. </w:t>
-      </w:r>
-    </w:p>
-    <w:p>
-      <w:pPr>
-        <w:rPr>
-          <w:rFonts w:asciiTheme="minorHAnsi" w:hAnsiTheme="minorHAnsi" w:cstheme="minorHAnsi"/>
-        </w:rPr>
-      </w:pPr>
-      <w:r>
-        <w:rPr>
-          <w:rFonts w:asciiTheme="minorHAnsi" w:hAnsiTheme="minorHAnsi" w:cstheme="minorHAnsi"/>
-        </w:rPr>
-        <w:t>Game Value uses no Bacon inputs and shares no valuation model with Bacon WAR. Both measures nevertheless describe the same games. They are built differently, but some agreement is expected because they are measuring the same players’ performances.</w:t>
+        <w:t xml:space="preserve">6. What the Results Establish</w:t>
+      </w:r>
+    </w:p>
+    <w:p>
+      <w:pPr>
+        <w:rPr>
+          <w:rFonts w:asciiTheme="minorHAnsi" w:hAnsiTheme="minorHAnsi" w:cstheme="minorHAnsi"/>
+        </w:rPr>
+      </w:pPr>
+      <w:r>
+        <w:rPr>
+          <w:rFonts w:asciiTheme="minorHAnsi" w:hAnsiTheme="minorHAnsi" w:cstheme="minorHAnsi"/>
+        </w:rPr>
+        <w:t xml:space="preserve">Players with higher trailing WAR generally went on to produce more Game Value, particularly among forwards. That gives some support to the Bacon WAR from which the model’s forecast is built. Whether the forecast agrees with Game Value more or less closely than the trailing total has not been tested.</w:t>
+      </w:r>
+    </w:p>
+    <w:p>
+      <w:pPr>
+        <w:rPr>
+          <w:rFonts w:asciiTheme="minorHAnsi" w:hAnsiTheme="minorHAnsi" w:cstheme="minorHAnsi"/>
+        </w:rPr>
+      </w:pPr>
+      <w:r>
+        <w:rPr>
+          <w:rFonts w:asciiTheme="minorHAnsi" w:hAnsiTheme="minorHAnsi" w:cstheme="minorHAnsi"/>
+        </w:rPr>
+        <w:t xml:space="preserve">Game Value uses no Bacon inputs and shares no valuation model with Bacon WAR. Both measures nevertheless describe the same games. They are built differently, but some agreement is expected because they are measuring the same players’ performances.</w:t>
       </w:r>
     </w:p>
     <w:sectPr>

</xml_diff>

<commit_message>
Investigation F closed; Circularity and Game Value updated
The forecast's gain in agreement with Game Value over the 60/40 trailing
total holds in each of 2,000 paired career draws, in every comparison.
The document's results section now reports the current model's measures
against all three Game Value versions, with the resample, seasons,
positions and the contract-status channel.

Co-Authored-By: Claude Opus 5.5 <noreply@anthropic.com>
Claude-Session: https://claude.ai/code/session_01KJQGvXbJQHJSXYBMj2qArp
</commit_message>
<xml_diff>
--- a/40_DOCS/Supervisor_Drafts/Circularity and Game Value.docx
+++ b/40_DOCS/Supervisor_Drafts/Circularity and Game Value.docx
@@ -26,7 +26,7 @@
         <w:rPr>
           <w:rFonts w:asciiTheme="minorHAnsi" w:hAnsiTheme="minorHAnsi" w:cstheme="minorHAnsi"/>
         </w:rPr>
-        <w:t xml:space="preserve">Game Value provides an independent check on the model’s production estimates. It measures on-ice performance using NHL play-by-play and shift data, with no Bacon WAR inputs. The two measures agree more closely for forwards than for defencemen. </w:t>
+        <w:t xml:space="preserve">Game Value provides an independent check on the model’s production estimates. It measures on-ice performance using NHL play-by-play and shift data, with no Bacon WAR inputs. The model’s forecast agrees with it more closely than the trailing WAR the forecast is built from, and the agreement is stronger for forwards than for defencemen.</w:t>
       </w:r>
     </w:p>
     <w:p>
@@ -66,7 +66,7 @@
         <w:rPr>
           <w:rFonts w:asciiTheme="minorHAnsi" w:hAnsiTheme="minorHAnsi" w:cstheme="minorHAnsi"/>
         </w:rPr>
-        <w:t xml:space="preserve">The check reported below compares a player’s trailing WAR, a weighted average of his Bacon WAR from the seasons before the valuation date, with his subsequent performance. It was run on the 60/40 two-season trailing total, which was the starting point of an earlier version of the model. The current forecast starts from a three-season trailing total and pulls it toward the league average, so the check tests the production measure the forecast is built from, not the forecast itself. It has not been repeated on the forecast.</w:t>
+        <w:t xml:space="preserve">The check compares a production measure, calculated from the seasons before the valuation date, with the player’s performance that season according to Game Value. It was first run on a 60/40 two-season trailing total, the starting point of an earlier version of the model. It has been repeated on the measures the current model uses: its three-season trailing total, its starting rate, and its forecast of WAR if he plays (Section 5).</w:t>
       </w:r>
     </w:p>
     <w:p>
@@ -93,20 +93,20 @@
         <w:rPr>
           <w:rFonts w:asciiTheme="minorHAnsi" w:hAnsiTheme="minorHAnsi" w:cstheme="minorHAnsi"/>
         </w:rPr>
-        <w:t xml:space="preserve">The chance of playing also reads one decision made by clubs: whether the player is under contract for the season, counting only contracts signed on or before the valuation date. Being under contract raises the odds that a player plays a season by a factor of about 3.5. A contract’s value therefore depends in part on the commitments the club has already made to the player.</w:t>
-      </w:r>
-    </w:p>
-    <w:p>
-      <w:pPr>
-        <w:rPr>
-          <w:rFonts w:asciiTheme="minorHAnsi" w:hAnsiTheme="minorHAnsi" w:cstheme="minorHAnsi"/>
-        </w:rPr>
-      </w:pPr>
-      <w:r>
-        <w:rPr>
-          <w:rFonts w:asciiTheme="minorHAnsi" w:hAnsiTheme="minorHAnsi" w:cstheme="minorHAnsi"/>
-        </w:rPr>
-        <w:t xml:space="preserve">This is not look-ahead, because each contract counted was public on the valuation date. It does mean that information clubs act on when they sign a player, including what they may know privately, can reach the valuation through his chance of playing. The back-test judges clubs’ trades against these valuations, so this channel is stated here as a possible source of agreement between the model and the market. The production forecast and the price line read no contract information; contract status enters through the chance of playing only.</w:t>
+        <w:t xml:space="preserve">The chance of playing also reads one decision made by clubs: whether the player is under contract for the season, counting only contracts signed on or before the valuation date (or, for a contract valued in its first season after a signing later than July 1, on or before its signing). Being under contract raises the odds that a player plays a season by a factor of about 6.8 in the valuation season and 3.2 three seasons out. A contract’s value therefore depends in part on the commitments the club has already made to the player.</w:t>
+      </w:r>
+    </w:p>
+    <w:p>
+      <w:pPr>
+        <w:rPr>
+          <w:rFonts w:asciiTheme="minorHAnsi" w:hAnsiTheme="minorHAnsi" w:cstheme="minorHAnsi"/>
+        </w:rPr>
+      </w:pPr>
+      <w:r>
+        <w:rPr>
+          <w:rFonts w:asciiTheme="minorHAnsi" w:hAnsiTheme="minorHAnsi" w:cstheme="minorHAnsi"/>
+        </w:rPr>
+        <w:t xml:space="preserve">This is not look-ahead, because each contract counted was public on the valuation date. It does mean that information clubs act on when they sign a player, including what they may know privately, can reach the valuation through his chance of playing. The back-test judges clubs’ trades against these valuations, so this channel is stated here as a possible source of agreement between the model and the market. The production forecast and the price line read no contract information; contract status enters through the chance of playing only. Section 5 shows that it does not carry the model’s agreement with Game Value.</w:t>
       </w:r>
     </w:p>
     <w:p>
@@ -344,33 +344,655 @@
         <w:rPr>
           <w:rFonts w:asciiTheme="minorHAnsi" w:hAnsiTheme="minorHAnsi" w:cstheme="minorHAnsi"/>
         </w:rPr>
-        <w:t xml:space="preserve">The main check compares each player’s 60/40 trailing WAR, calculated before the season, with his performance that season according to GV-adj. Both sides are measured in wins: Bacon WAR is already in win units, and GV-adj is converted from goals to wins. Across 6,027 player-seasons, the correlation was 0.576. It ranged from 0.55 to 0.61 in each of the nine seasons, suggesting that no single season drove the result. Comparing the same trailing estimate with performance one season further ahead gave a correlation of 0.538.</w:t>
-      </w:r>
-    </w:p>
-    <w:p>
-      <w:pPr>
-        <w:rPr>
-          <w:rFonts w:asciiTheme="minorHAnsi" w:hAnsiTheme="minorHAnsi" w:cstheme="minorHAnsi"/>
-        </w:rPr>
-      </w:pPr>
-      <w:r>
-        <w:rPr>
-          <w:rFonts w:asciiTheme="minorHAnsi" w:hAnsiTheme="minorHAnsi" w:cstheme="minorHAnsi"/>
-        </w:rPr>
-        <w:t xml:space="preserve">Two checks used raw Game Value. One measured performance above a replacement-level baseline, the reference point used by Bacon WAR. The other retained the zero-sum allocation, in which player contributions sum to the team’s total. Their correlations with trailing WAR were 0.609 and 0.564, respectively. Both were stable across seasons and weakened slightly at the later horizon. These are variants built from the same games, so their agreement shows that the result does not depend entirely on the GV-adj adjustments.</w:t>
-      </w:r>
-    </w:p>
-    <w:p>
-      <w:pPr>
-        <w:rPr>
-          <w:rFonts w:asciiTheme="minorHAnsi" w:hAnsiTheme="minorHAnsi" w:cstheme="minorHAnsi"/>
-        </w:rPr>
-      </w:pPr>
-      <w:r>
-        <w:rPr>
-          <w:rFonts w:asciiTheme="minorHAnsi" w:hAnsiTheme="minorHAnsi" w:cstheme="minorHAnsi"/>
-        </w:rPr>
-        <w:t xml:space="preserve">The main correlation was 0.648 for forwards and 0.302 for defencemen. The replacement-based raw variant gave a higher defensive correlation of 0.442, but the rebase can inflate that figure. The other two versions put the defensive correlation closer to 0.28-0.30.</w:t>
+        <w:t xml:space="preserve">The main check compares a production measure, calculated before the season, with the player’s performance that season according to GV-adj. Both sides are measured in wins: Bacon WAR is already in win units, and GV-adj is converted from goals to wins at 5.903 goals a win. The check was first run on the 60/40 two-season trailing total, across 6,027 player-seasons, with a correlation of 0.576; that result was reproduced before the current model’s measures were scored. Each measure is compared on the same 6,027 player-seasons, of 1,319 players, and each is taken from the valuation date before the season it is compared with. Two checks use raw Game Value instead of GV-adj. One measures performance above a replacement-level baseline, the reference point used by Bacon WAR; the other keeps the zero-sum allocation, in which player contributions sum to the team’s total. The table gives the correlation of each measure with each version.</w:t>
+      </w:r>
+    </w:p>
+    <w:tbl>
+      <w:tblPr>
+        <w:tblW w:w="9360" w:type="dxa"/>
+        <w:tblBorders>
+          <w:top w:val="single" w:sz="4" w:space="0" w:color="A6A6A6"/>
+          <w:left w:val="single" w:sz="4" w:space="0" w:color="A6A6A6"/>
+          <w:bottom w:val="single" w:sz="4" w:space="0" w:color="A6A6A6"/>
+          <w:right w:val="single" w:sz="4" w:space="0" w:color="A6A6A6"/>
+          <w:insideH w:val="single" w:sz="4" w:space="0" w:color="A6A6A6"/>
+          <w:insideV w:val="single" w:sz="4" w:space="0" w:color="A6A6A6"/>
+        </w:tblBorders>
+        <w:tblLayout w:type="fixed"/>
+        <w:tblCellMar>
+          <w:left w:w="80" w:type="dxa"/>
+          <w:right w:w="80" w:type="dxa"/>
+        </w:tblCellMar>
+      </w:tblPr>
+      <w:tblGrid>
+        <w:gridCol w:w="4560"/>
+        <w:gridCol w:w="1600"/>
+        <w:gridCol w:w="1600"/>
+        <w:gridCol w:w="1600"/>
+      </w:tblGrid>
+      <w:tr>
+        <w:trPr>
+          <w:tblHeader/>
+          <w:cantSplit/>
+        </w:trPr>
+        <w:tc>
+          <w:tcPr>
+            <w:tcW w:w="4560" w:type="dxa"/>
+            <w:shd w:val="clear" w:color="auto" w:fill="E7E6E6"/>
+          </w:tcPr>
+          <w:p>
+            <w:pPr>
+              <w:spacing w:before="20" w:after="20" w:line="240" w:lineRule="auto"/>
+              <w:jc w:val="left"/>
+              <w:rPr>
+                <w:rFonts w:asciiTheme="minorHAnsi" w:hAnsiTheme="minorHAnsi" w:cstheme="minorHAnsi"/>
+              </w:rPr>
+            </w:pPr>
+            <w:r>
+              <w:rPr>
+                <w:rFonts w:asciiTheme="minorHAnsi" w:hAnsiTheme="minorHAnsi" w:cstheme="minorHAnsi"/>
+                <w:b/>
+                <w:sz w:val="19"/>
+                <w:szCs w:val="19"/>
+              </w:rPr>
+              <w:t xml:space="preserve">Measure (calculated before the season)</w:t>
+            </w:r>
+          </w:p>
+        </w:tc>
+        <w:tc>
+          <w:tcPr>
+            <w:tcW w:w="1600" w:type="dxa"/>
+            <w:shd w:val="clear" w:color="auto" w:fill="E7E6E6"/>
+          </w:tcPr>
+          <w:p>
+            <w:pPr>
+              <w:spacing w:before="20" w:after="20" w:line="240" w:lineRule="auto"/>
+              <w:jc w:val="right"/>
+              <w:rPr>
+                <w:rFonts w:asciiTheme="minorHAnsi" w:hAnsiTheme="minorHAnsi" w:cstheme="minorHAnsi"/>
+              </w:rPr>
+            </w:pPr>
+            <w:r>
+              <w:rPr>
+                <w:rFonts w:asciiTheme="minorHAnsi" w:hAnsiTheme="minorHAnsi" w:cstheme="minorHAnsi"/>
+                <w:b/>
+                <w:sz w:val="19"/>
+                <w:szCs w:val="19"/>
+              </w:rPr>
+              <w:t xml:space="preserve">GV-adj</w:t>
+            </w:r>
+          </w:p>
+        </w:tc>
+        <w:tc>
+          <w:tcPr>
+            <w:tcW w:w="1600" w:type="dxa"/>
+            <w:shd w:val="clear" w:color="auto" w:fill="E7E6E6"/>
+          </w:tcPr>
+          <w:p>
+            <w:pPr>
+              <w:spacing w:before="20" w:after="20" w:line="240" w:lineRule="auto"/>
+              <w:jc w:val="right"/>
+              <w:rPr>
+                <w:rFonts w:asciiTheme="minorHAnsi" w:hAnsiTheme="minorHAnsi" w:cstheme="minorHAnsi"/>
+              </w:rPr>
+            </w:pPr>
+            <w:r>
+              <w:rPr>
+                <w:rFonts w:asciiTheme="minorHAnsi" w:hAnsiTheme="minorHAnsi" w:cstheme="minorHAnsi"/>
+                <w:b/>
+                <w:sz w:val="19"/>
+                <w:szCs w:val="19"/>
+              </w:rPr>
+              <w:t xml:space="preserve">Raw, vs replacement</w:t>
+            </w:r>
+          </w:p>
+        </w:tc>
+        <w:tc>
+          <w:tcPr>
+            <w:tcW w:w="1600" w:type="dxa"/>
+            <w:shd w:val="clear" w:color="auto" w:fill="E7E6E6"/>
+          </w:tcPr>
+          <w:p>
+            <w:pPr>
+              <w:spacing w:before="20" w:after="20" w:line="240" w:lineRule="auto"/>
+              <w:jc w:val="right"/>
+              <w:rPr>
+                <w:rFonts w:asciiTheme="minorHAnsi" w:hAnsiTheme="minorHAnsi" w:cstheme="minorHAnsi"/>
+              </w:rPr>
+            </w:pPr>
+            <w:r>
+              <w:rPr>
+                <w:rFonts w:asciiTheme="minorHAnsi" w:hAnsiTheme="minorHAnsi" w:cstheme="minorHAnsi"/>
+                <w:b/>
+                <w:sz w:val="19"/>
+                <w:szCs w:val="19"/>
+              </w:rPr>
+              <w:t xml:space="preserve">Raw, zero-sum</w:t>
+            </w:r>
+          </w:p>
+        </w:tc>
+      </w:tr>
+      <w:tr>
+        <w:trPr>
+          <w:cantSplit/>
+        </w:trPr>
+        <w:tc>
+          <w:tcPr>
+            <w:tcW w:w="4560" w:type="dxa"/>
+          </w:tcPr>
+          <w:p>
+            <w:pPr>
+              <w:spacing w:before="20" w:after="20" w:line="240" w:lineRule="auto"/>
+              <w:jc w:val="left"/>
+              <w:rPr>
+                <w:rFonts w:asciiTheme="minorHAnsi" w:hAnsiTheme="minorHAnsi" w:cstheme="minorHAnsi"/>
+              </w:rPr>
+            </w:pPr>
+            <w:r>
+              <w:rPr>
+                <w:rFonts w:asciiTheme="minorHAnsi" w:hAnsiTheme="minorHAnsi" w:cstheme="minorHAnsi"/>
+                <w:sz w:val="19"/>
+                <w:szCs w:val="19"/>
+              </w:rPr>
+              <w:t xml:space="preserve">Trailing total, 60/40 over two seasons (earlier version)</w:t>
+            </w:r>
+          </w:p>
+        </w:tc>
+        <w:tc>
+          <w:tcPr>
+            <w:tcW w:w="1600" w:type="dxa"/>
+          </w:tcPr>
+          <w:p>
+            <w:pPr>
+              <w:spacing w:before="20" w:after="20" w:line="240" w:lineRule="auto"/>
+              <w:jc w:val="right"/>
+              <w:rPr>
+                <w:rFonts w:asciiTheme="minorHAnsi" w:hAnsiTheme="minorHAnsi" w:cstheme="minorHAnsi"/>
+              </w:rPr>
+            </w:pPr>
+            <w:r>
+              <w:rPr>
+                <w:rFonts w:asciiTheme="minorHAnsi" w:hAnsiTheme="minorHAnsi" w:cstheme="minorHAnsi"/>
+                <w:sz w:val="19"/>
+                <w:szCs w:val="19"/>
+              </w:rPr>
+              <w:t xml:space="preserve">0.576</w:t>
+            </w:r>
+          </w:p>
+        </w:tc>
+        <w:tc>
+          <w:tcPr>
+            <w:tcW w:w="1600" w:type="dxa"/>
+          </w:tcPr>
+          <w:p>
+            <w:pPr>
+              <w:spacing w:before="20" w:after="20" w:line="240" w:lineRule="auto"/>
+              <w:jc w:val="right"/>
+              <w:rPr>
+                <w:rFonts w:asciiTheme="minorHAnsi" w:hAnsiTheme="minorHAnsi" w:cstheme="minorHAnsi"/>
+              </w:rPr>
+            </w:pPr>
+            <w:r>
+              <w:rPr>
+                <w:rFonts w:asciiTheme="minorHAnsi" w:hAnsiTheme="minorHAnsi" w:cstheme="minorHAnsi"/>
+                <w:sz w:val="19"/>
+                <w:szCs w:val="19"/>
+              </w:rPr>
+              <w:t xml:space="preserve">0.609</w:t>
+            </w:r>
+          </w:p>
+        </w:tc>
+        <w:tc>
+          <w:tcPr>
+            <w:tcW w:w="1600" w:type="dxa"/>
+          </w:tcPr>
+          <w:p>
+            <w:pPr>
+              <w:spacing w:before="20" w:after="20" w:line="240" w:lineRule="auto"/>
+              <w:jc w:val="right"/>
+              <w:rPr>
+                <w:rFonts w:asciiTheme="minorHAnsi" w:hAnsiTheme="minorHAnsi" w:cstheme="minorHAnsi"/>
+              </w:rPr>
+            </w:pPr>
+            <w:r>
+              <w:rPr>
+                <w:rFonts w:asciiTheme="minorHAnsi" w:hAnsiTheme="minorHAnsi" w:cstheme="minorHAnsi"/>
+                <w:sz w:val="19"/>
+                <w:szCs w:val="19"/>
+              </w:rPr>
+              <w:t xml:space="preserve">0.564</w:t>
+            </w:r>
+          </w:p>
+        </w:tc>
+      </w:tr>
+      <w:tr>
+        <w:trPr>
+          <w:cantSplit/>
+        </w:trPr>
+        <w:tc>
+          <w:tcPr>
+            <w:tcW w:w="4560" w:type="dxa"/>
+          </w:tcPr>
+          <w:p>
+            <w:pPr>
+              <w:spacing w:before="20" w:after="20" w:line="240" w:lineRule="auto"/>
+              <w:jc w:val="left"/>
+              <w:rPr>
+                <w:rFonts w:asciiTheme="minorHAnsi" w:hAnsiTheme="minorHAnsi" w:cstheme="minorHAnsi"/>
+              </w:rPr>
+            </w:pPr>
+            <w:r>
+              <w:rPr>
+                <w:rFonts w:asciiTheme="minorHAnsi" w:hAnsiTheme="minorHAnsi" w:cstheme="minorHAnsi"/>
+                <w:sz w:val="19"/>
+                <w:szCs w:val="19"/>
+              </w:rPr>
+              <w:t xml:space="preserve">Trailing total, 50/30/20 over three seasons</w:t>
+            </w:r>
+          </w:p>
+        </w:tc>
+        <w:tc>
+          <w:tcPr>
+            <w:tcW w:w="1600" w:type="dxa"/>
+          </w:tcPr>
+          <w:p>
+            <w:pPr>
+              <w:spacing w:before="20" w:after="20" w:line="240" w:lineRule="auto"/>
+              <w:jc w:val="right"/>
+              <w:rPr>
+                <w:rFonts w:asciiTheme="minorHAnsi" w:hAnsiTheme="minorHAnsi" w:cstheme="minorHAnsi"/>
+              </w:rPr>
+            </w:pPr>
+            <w:r>
+              <w:rPr>
+                <w:rFonts w:asciiTheme="minorHAnsi" w:hAnsiTheme="minorHAnsi" w:cstheme="minorHAnsi"/>
+                <w:sz w:val="19"/>
+                <w:szCs w:val="19"/>
+              </w:rPr>
+              <w:t xml:space="preserve">0.588</w:t>
+            </w:r>
+          </w:p>
+        </w:tc>
+        <w:tc>
+          <w:tcPr>
+            <w:tcW w:w="1600" w:type="dxa"/>
+          </w:tcPr>
+          <w:p>
+            <w:pPr>
+              <w:spacing w:before="20" w:after="20" w:line="240" w:lineRule="auto"/>
+              <w:jc w:val="right"/>
+              <w:rPr>
+                <w:rFonts w:asciiTheme="minorHAnsi" w:hAnsiTheme="minorHAnsi" w:cstheme="minorHAnsi"/>
+              </w:rPr>
+            </w:pPr>
+            <w:r>
+              <w:rPr>
+                <w:rFonts w:asciiTheme="minorHAnsi" w:hAnsiTheme="minorHAnsi" w:cstheme="minorHAnsi"/>
+                <w:sz w:val="19"/>
+                <w:szCs w:val="19"/>
+              </w:rPr>
+              <w:t xml:space="preserve">0.621</w:t>
+            </w:r>
+          </w:p>
+        </w:tc>
+        <w:tc>
+          <w:tcPr>
+            <w:tcW w:w="1600" w:type="dxa"/>
+          </w:tcPr>
+          <w:p>
+            <w:pPr>
+              <w:spacing w:before="20" w:after="20" w:line="240" w:lineRule="auto"/>
+              <w:jc w:val="right"/>
+              <w:rPr>
+                <w:rFonts w:asciiTheme="minorHAnsi" w:hAnsiTheme="minorHAnsi" w:cstheme="minorHAnsi"/>
+              </w:rPr>
+            </w:pPr>
+            <w:r>
+              <w:rPr>
+                <w:rFonts w:asciiTheme="minorHAnsi" w:hAnsiTheme="minorHAnsi" w:cstheme="minorHAnsi"/>
+                <w:sz w:val="19"/>
+                <w:szCs w:val="19"/>
+              </w:rPr>
+              <w:t xml:space="preserve">0.576</w:t>
+            </w:r>
+          </w:p>
+        </w:tc>
+      </w:tr>
+      <w:tr>
+        <w:trPr>
+          <w:cantSplit/>
+        </w:trPr>
+        <w:tc>
+          <w:tcPr>
+            <w:tcW w:w="4560" w:type="dxa"/>
+          </w:tcPr>
+          <w:p>
+            <w:pPr>
+              <w:spacing w:before="20" w:after="20" w:line="240" w:lineRule="auto"/>
+              <w:jc w:val="left"/>
+              <w:rPr>
+                <w:rFonts w:asciiTheme="minorHAnsi" w:hAnsiTheme="minorHAnsi" w:cstheme="minorHAnsi"/>
+              </w:rPr>
+            </w:pPr>
+            <w:r>
+              <w:rPr>
+                <w:rFonts w:asciiTheme="minorHAnsi" w:hAnsiTheme="minorHAnsi" w:cstheme="minorHAnsi"/>
+                <w:sz w:val="19"/>
+                <w:szCs w:val="19"/>
+              </w:rPr>
+              <w:t xml:space="preserve">Starting rate (per 82 games)</w:t>
+            </w:r>
+          </w:p>
+        </w:tc>
+        <w:tc>
+          <w:tcPr>
+            <w:tcW w:w="1600" w:type="dxa"/>
+          </w:tcPr>
+          <w:p>
+            <w:pPr>
+              <w:spacing w:before="20" w:after="20" w:line="240" w:lineRule="auto"/>
+              <w:jc w:val="right"/>
+              <w:rPr>
+                <w:rFonts w:asciiTheme="minorHAnsi" w:hAnsiTheme="minorHAnsi" w:cstheme="minorHAnsi"/>
+              </w:rPr>
+            </w:pPr>
+            <w:r>
+              <w:rPr>
+                <w:rFonts w:asciiTheme="minorHAnsi" w:hAnsiTheme="minorHAnsi" w:cstheme="minorHAnsi"/>
+                <w:sz w:val="19"/>
+                <w:szCs w:val="19"/>
+              </w:rPr>
+              <w:t xml:space="preserve">0.604</w:t>
+            </w:r>
+          </w:p>
+        </w:tc>
+        <w:tc>
+          <w:tcPr>
+            <w:tcW w:w="1600" w:type="dxa"/>
+          </w:tcPr>
+          <w:p>
+            <w:pPr>
+              <w:spacing w:before="20" w:after="20" w:line="240" w:lineRule="auto"/>
+              <w:jc w:val="right"/>
+              <w:rPr>
+                <w:rFonts w:asciiTheme="minorHAnsi" w:hAnsiTheme="minorHAnsi" w:cstheme="minorHAnsi"/>
+              </w:rPr>
+            </w:pPr>
+            <w:r>
+              <w:rPr>
+                <w:rFonts w:asciiTheme="minorHAnsi" w:hAnsiTheme="minorHAnsi" w:cstheme="minorHAnsi"/>
+                <w:sz w:val="19"/>
+                <w:szCs w:val="19"/>
+              </w:rPr>
+              <w:t xml:space="preserve">0.611</w:t>
+            </w:r>
+          </w:p>
+        </w:tc>
+        <w:tc>
+          <w:tcPr>
+            <w:tcW w:w="1600" w:type="dxa"/>
+          </w:tcPr>
+          <w:p>
+            <w:pPr>
+              <w:spacing w:before="20" w:after="20" w:line="240" w:lineRule="auto"/>
+              <w:jc w:val="right"/>
+              <w:rPr>
+                <w:rFonts w:asciiTheme="minorHAnsi" w:hAnsiTheme="minorHAnsi" w:cstheme="minorHAnsi"/>
+              </w:rPr>
+            </w:pPr>
+            <w:r>
+              <w:rPr>
+                <w:rFonts w:asciiTheme="minorHAnsi" w:hAnsiTheme="minorHAnsi" w:cstheme="minorHAnsi"/>
+                <w:sz w:val="19"/>
+                <w:szCs w:val="19"/>
+              </w:rPr>
+              <w:t xml:space="preserve">0.595</w:t>
+            </w:r>
+          </w:p>
+        </w:tc>
+      </w:tr>
+      <w:tr>
+        <w:trPr>
+          <w:cantSplit/>
+        </w:trPr>
+        <w:tc>
+          <w:tcPr>
+            <w:tcW w:w="4560" w:type="dxa"/>
+          </w:tcPr>
+          <w:p>
+            <w:pPr>
+              <w:spacing w:before="20" w:after="20" w:line="240" w:lineRule="auto"/>
+              <w:jc w:val="left"/>
+              <w:rPr>
+                <w:rFonts w:asciiTheme="minorHAnsi" w:hAnsiTheme="minorHAnsi" w:cstheme="minorHAnsi"/>
+              </w:rPr>
+            </w:pPr>
+            <w:r>
+              <w:rPr>
+                <w:rFonts w:asciiTheme="minorHAnsi" w:hAnsiTheme="minorHAnsi" w:cstheme="minorHAnsi"/>
+                <w:sz w:val="19"/>
+                <w:szCs w:val="19"/>
+              </w:rPr>
+              <w:t xml:space="preserve">Forecast WAR if he plays</w:t>
+            </w:r>
+          </w:p>
+        </w:tc>
+        <w:tc>
+          <w:tcPr>
+            <w:tcW w:w="1600" w:type="dxa"/>
+          </w:tcPr>
+          <w:p>
+            <w:pPr>
+              <w:spacing w:before="20" w:after="20" w:line="240" w:lineRule="auto"/>
+              <w:jc w:val="right"/>
+              <w:rPr>
+                <w:rFonts w:asciiTheme="minorHAnsi" w:hAnsiTheme="minorHAnsi" w:cstheme="minorHAnsi"/>
+              </w:rPr>
+            </w:pPr>
+            <w:r>
+              <w:rPr>
+                <w:rFonts w:asciiTheme="minorHAnsi" w:hAnsiTheme="minorHAnsi" w:cstheme="minorHAnsi"/>
+                <w:sz w:val="19"/>
+                <w:szCs w:val="19"/>
+              </w:rPr>
+              <w:t xml:space="preserve">0.624</w:t>
+            </w:r>
+          </w:p>
+        </w:tc>
+        <w:tc>
+          <w:tcPr>
+            <w:tcW w:w="1600" w:type="dxa"/>
+          </w:tcPr>
+          <w:p>
+            <w:pPr>
+              <w:spacing w:before="20" w:after="20" w:line="240" w:lineRule="auto"/>
+              <w:jc w:val="right"/>
+              <w:rPr>
+                <w:rFonts w:asciiTheme="minorHAnsi" w:hAnsiTheme="minorHAnsi" w:cstheme="minorHAnsi"/>
+              </w:rPr>
+            </w:pPr>
+            <w:r>
+              <w:rPr>
+                <w:rFonts w:asciiTheme="minorHAnsi" w:hAnsiTheme="minorHAnsi" w:cstheme="minorHAnsi"/>
+                <w:sz w:val="19"/>
+                <w:szCs w:val="19"/>
+              </w:rPr>
+              <w:t xml:space="preserve">0.638</w:t>
+            </w:r>
+          </w:p>
+        </w:tc>
+        <w:tc>
+          <w:tcPr>
+            <w:tcW w:w="1600" w:type="dxa"/>
+          </w:tcPr>
+          <w:p>
+            <w:pPr>
+              <w:spacing w:before="20" w:after="20" w:line="240" w:lineRule="auto"/>
+              <w:jc w:val="right"/>
+              <w:rPr>
+                <w:rFonts w:asciiTheme="minorHAnsi" w:hAnsiTheme="minorHAnsi" w:cstheme="minorHAnsi"/>
+              </w:rPr>
+            </w:pPr>
+            <w:r>
+              <w:rPr>
+                <w:rFonts w:asciiTheme="minorHAnsi" w:hAnsiTheme="minorHAnsi" w:cstheme="minorHAnsi"/>
+                <w:sz w:val="19"/>
+                <w:szCs w:val="19"/>
+              </w:rPr>
+              <w:t xml:space="preserve">0.612</w:t>
+            </w:r>
+          </w:p>
+        </w:tc>
+      </w:tr>
+      <w:tr>
+        <w:trPr>
+          <w:cantSplit/>
+        </w:trPr>
+        <w:tc>
+          <w:tcPr>
+            <w:tcW w:w="4560" w:type="dxa"/>
+          </w:tcPr>
+          <w:p>
+            <w:pPr>
+              <w:spacing w:before="20" w:after="20" w:line="240" w:lineRule="auto"/>
+              <w:jc w:val="left"/>
+              <w:rPr>
+                <w:rFonts w:asciiTheme="minorHAnsi" w:hAnsiTheme="minorHAnsi" w:cstheme="minorHAnsi"/>
+              </w:rPr>
+            </w:pPr>
+            <w:r>
+              <w:rPr>
+                <w:rFonts w:asciiTheme="minorHAnsi" w:hAnsiTheme="minorHAnsi" w:cstheme="minorHAnsi"/>
+                <w:sz w:val="19"/>
+                <w:szCs w:val="19"/>
+              </w:rPr>
+              <w:t xml:space="preserve">Expected WAR (times the chance of playing)</w:t>
+            </w:r>
+          </w:p>
+        </w:tc>
+        <w:tc>
+          <w:tcPr>
+            <w:tcW w:w="1600" w:type="dxa"/>
+          </w:tcPr>
+          <w:p>
+            <w:pPr>
+              <w:spacing w:before="20" w:after="20" w:line="240" w:lineRule="auto"/>
+              <w:jc w:val="right"/>
+              <w:rPr>
+                <w:rFonts w:asciiTheme="minorHAnsi" w:hAnsiTheme="minorHAnsi" w:cstheme="minorHAnsi"/>
+              </w:rPr>
+            </w:pPr>
+            <w:r>
+              <w:rPr>
+                <w:rFonts w:asciiTheme="minorHAnsi" w:hAnsiTheme="minorHAnsi" w:cstheme="minorHAnsi"/>
+                <w:sz w:val="19"/>
+                <w:szCs w:val="19"/>
+              </w:rPr>
+              <w:t xml:space="preserve">0.623</w:t>
+            </w:r>
+          </w:p>
+        </w:tc>
+        <w:tc>
+          <w:tcPr>
+            <w:tcW w:w="1600" w:type="dxa"/>
+          </w:tcPr>
+          <w:p>
+            <w:pPr>
+              <w:spacing w:before="20" w:after="20" w:line="240" w:lineRule="auto"/>
+              <w:jc w:val="right"/>
+              <w:rPr>
+                <w:rFonts w:asciiTheme="minorHAnsi" w:hAnsiTheme="minorHAnsi" w:cstheme="minorHAnsi"/>
+              </w:rPr>
+            </w:pPr>
+            <w:r>
+              <w:rPr>
+                <w:rFonts w:asciiTheme="minorHAnsi" w:hAnsiTheme="minorHAnsi" w:cstheme="minorHAnsi"/>
+                <w:sz w:val="19"/>
+                <w:szCs w:val="19"/>
+              </w:rPr>
+              <w:t xml:space="preserve">0.640</w:t>
+            </w:r>
+          </w:p>
+        </w:tc>
+        <w:tc>
+          <w:tcPr>
+            <w:tcW w:w="1600" w:type="dxa"/>
+          </w:tcPr>
+          <w:p>
+            <w:pPr>
+              <w:spacing w:before="20" w:after="20" w:line="240" w:lineRule="auto"/>
+              <w:jc w:val="right"/>
+              <w:rPr>
+                <w:rFonts w:asciiTheme="minorHAnsi" w:hAnsiTheme="minorHAnsi" w:cstheme="minorHAnsi"/>
+              </w:rPr>
+            </w:pPr>
+            <w:r>
+              <w:rPr>
+                <w:rFonts w:asciiTheme="minorHAnsi" w:hAnsiTheme="minorHAnsi" w:cstheme="minorHAnsi"/>
+                <w:sz w:val="19"/>
+                <w:szCs w:val="19"/>
+              </w:rPr>
+              <w:t xml:space="preserve">0.610</w:t>
+            </w:r>
+          </w:p>
+        </w:tc>
+      </w:tr>
+    </w:tbl>
+    <w:p>
+      <w:pPr>
+        <w:spacing w:after="80"/>
+      </w:pPr>
+    </w:p>
+    <w:p>
+      <w:pPr>
+        <w:rPr>
+          <w:rFonts w:asciiTheme="minorHAnsi" w:hAnsiTheme="minorHAnsi" w:cstheme="minorHAnsi"/>
+        </w:rPr>
+      </w:pPr>
+      <w:r>
+        <w:rPr>
+          <w:rFonts w:asciiTheme="minorHAnsi" w:hAnsiTheme="minorHAnsi" w:cstheme="minorHAnsi"/>
+        </w:rPr>
+        <w:t xml:space="preserve">Each main step the current model takes moves the measure closer to Game Value. The three-season trailing total agrees more closely than the two-season one, and the forecast of WAR if he plays agrees more closely than either: 0.624 against 0.576 for the 60/40 total. To test whether these gains could be chance, the players’ careers were resampled 2,000 times, with every measure scored on the same drawn players each time. Against each version of Game Value, the forecast’s correlation exceeded the 60/40 total’s in each of the 2,000 draws, by 0.048 against GV-adj (95% range 0.040 to 0.056), and exceeded the three-season total’s in each draw, by 0.035 against GV-adj (0.028 to 0.043). The starting rate, a rate per 82 games, lies between the trailing totals and the forecast against GV-adj and the zero-sum variant, but falls below the three-season total against the replacement-based variant (0.611 against 0.621).</w:t>
+      </w:r>
+    </w:p>
+    <w:p>
+      <w:pPr>
+        <w:rPr>
+          <w:rFonts w:asciiTheme="minorHAnsi" w:hAnsiTheme="minorHAnsi" w:cstheme="minorHAnsi"/>
+        </w:rPr>
+      </w:pPr>
+      <w:r>
+        <w:rPr>
+          <w:rFonts w:asciiTheme="minorHAnsi" w:hAnsiTheme="minorHAnsi" w:cstheme="minorHAnsi"/>
+        </w:rPr>
+        <w:t xml:space="preserve">The gain holds across seasons and horizons. The forecast’s correlation with GV-adj is higher than the 60/40 total’s in each of the nine seasons (0.607 to 0.656, against 0.545 to 0.612). One season further ahead, the forecast for that season reaches 0.602 against 0.538 for the 60/40 total; the 95% range of the gain is 0.052 to 0.075. All three versions of Game Value rank the forecast above the three-season total and that total above the two-season one, so the result does not depend on the GV-adj adjustments.</w:t>
+      </w:r>
+    </w:p>
+    <w:p>
+      <w:pPr>
+        <w:rPr>
+          <w:rFonts w:asciiTheme="minorHAnsi" w:hAnsiTheme="minorHAnsi" w:cstheme="minorHAnsi"/>
+        </w:rPr>
+      </w:pPr>
+      <w:r>
+        <w:rPr>
+          <w:rFonts w:asciiTheme="minorHAnsi" w:hAnsiTheme="minorHAnsi" w:cstheme="minorHAnsi"/>
+        </w:rPr>
+        <w:t xml:space="preserve">The agreement remains much stronger for forwards than for defencemen. Against GV-adj, the forecast’s correlation is 0.681 for forwards (3,937 player-seasons) and 0.330 for defencemen (2,090), against 0.649 and 0.302 for the 60/40 total; the forecast is higher in each of the 2,000 draws in both groups. For defencemen, the three-season total alone does not reliably improve on the two-season one (higher in 1,742 of the 2,000 draws). The replacement-based raw variant gives a higher defensive correlation, 0.476 for the forecast, but the rebase can inflate that figure; the other two versions put it at 0.30 to 0.33.</w:t>
+      </w:r>
+    </w:p>
+    <w:p>
+      <w:pPr>
+        <w:rPr>
+          <w:rFonts w:asciiTheme="minorHAnsi" w:hAnsiTheme="minorHAnsi" w:cstheme="minorHAnsi"/>
+        </w:rPr>
+      </w:pPr>
+      <w:r>
+        <w:rPr>
+          <w:rFonts w:asciiTheme="minorHAnsi" w:hAnsiTheme="minorHAnsi" w:cstheme="minorHAnsi"/>
+        </w:rPr>
+        <w:t xml:space="preserve">Contract status does not carry the agreement. Expected WAR, which multiplies the forecast by the chance of playing, agrees with GV-adj as closely as the forecast alone (0.623 against 0.624), and refitting the chance of playing without contract status changes the correlation by 0.001. Counting the 491 seasons in which a contracted player did not play as zero Game Value gives the same result: 0.609 with contract status and 0.610 without.</w:t>
       </w:r>
     </w:p>
     <w:p>
@@ -397,7 +1019,7 @@
         <w:rPr>
           <w:rFonts w:asciiTheme="minorHAnsi" w:hAnsiTheme="minorHAnsi" w:cstheme="minorHAnsi"/>
         </w:rPr>
-        <w:t xml:space="preserve">Players with higher trailing WAR generally went on to produce more Game Value, particularly among forwards. That gives some support to the Bacon WAR from which the model’s forecast is built. Whether the forecast agrees with Game Value more or less closely than the trailing total has not been tested.</w:t>
+        <w:t xml:space="preserve">Players with higher forecast production generally went on to produce more Game Value, particularly among forwards. The forecast tracks Game Value more closely than the trailing WAR it is built from, and none of that agreement comes through contract status. That supports the Bacon WAR the model reads, and shows that the forecast built from it moves toward independently measured play rather than away from it.</w:t>
       </w:r>
     </w:p>
     <w:p>

</xml_diff>